<commit_message>
Uploaded the most up to date IP Address Plan
I made some additions to the IP address plan and I uploaded the new document
</commit_message>
<xml_diff>
--- a/downloads/SOE - Enterprise_IP_Address_Plan.docx
+++ b/downloads/SOE - Enterprise_IP_Address_Plan.docx
@@ -5852,8 +5852,6 @@
           <w:szCs w:val="27"/>
         </w:rPr>
       </w:pPr>
-      <w:bookmarkStart w:id="0" w:name="_GoBack"/>
-      <w:bookmarkEnd w:id="0"/>
       <w:r>
         <w:rPr>
           <w:b/>
@@ -9230,6 +9228,182 @@
     </w:p>
     <w:p>
       <w:pPr>
+        <w:pStyle w:val="Heading3"/>
+      </w:pPr>
+      <w:r>
+        <w:t>Remote Site Interface Addressing</w:t>
+      </w:r>
+      <w:r>
+        <w:t xml:space="preserve"> (Tucson &amp; Flagstaff)</w:t>
+      </w:r>
+    </w:p>
+    <w:p>
+      <w:pPr>
+        <w:spacing w:before="100" w:beforeAutospacing="1" w:after="100" w:afterAutospacing="1"/>
+      </w:pPr>
+      <w:r>
+        <w:t xml:space="preserve">The Enterprise IP Addressing Plan includes subnet allocations for both current operational requirements and anticipated future growth. However, </w:t>
+      </w:r>
+      <w:r>
+        <w:rPr>
+          <w:b/>
+          <w:bCs/>
+        </w:rPr>
+        <w:t>subnet planning does not necessarily mean that a subnet will be implemented or assigned to a device interface during the current deployment.</w:t>
+      </w:r>
+    </w:p>
+    <w:p>
+      <w:pPr>
+        <w:spacing w:before="100" w:beforeAutospacing="1" w:after="100" w:afterAutospacing="1"/>
+      </w:pPr>
+      <w:r>
+        <w:t xml:space="preserve">For the </w:t>
+      </w:r>
+      <w:r>
+        <w:rPr>
+          <w:b/>
+          <w:bCs/>
+        </w:rPr>
+        <w:t>Tucson Distribution Center</w:t>
+      </w:r>
+      <w:r>
+        <w:t xml:space="preserve"> and </w:t>
+      </w:r>
+      <w:r>
+        <w:rPr>
+          <w:b/>
+          <w:bCs/>
+        </w:rPr>
+        <w:t>Flagstaff Retail Store</w:t>
+      </w:r>
+      <w:r>
+        <w:t>, interface addressing is documented only for the LAN networks that are part of the current implementation:</w:t>
+      </w:r>
+    </w:p>
+    <w:p>
+      <w:pPr>
+        <w:numPr>
+          <w:ilvl w:val="0"/>
+          <w:numId w:val="42"/>
+        </w:numPr>
+        <w:spacing w:before="100" w:beforeAutospacing="1" w:after="100" w:afterAutospacing="1"/>
+      </w:pPr>
+      <w:r>
+        <w:rPr>
+          <w:b/>
+          <w:bCs/>
+        </w:rPr>
+        <w:t>Tucson Distribution Center:</w:t>
+      </w:r>
+      <w:r>
+        <w:t xml:space="preserve"> Warehouse network</w:t>
+      </w:r>
+      <w:r>
+        <w:t xml:space="preserve"> – </w:t>
+      </w:r>
+      <w:r>
+        <w:rPr>
+          <w:b/>
+        </w:rPr>
+        <w:t>VLAN 1</w:t>
+      </w:r>
+    </w:p>
+    <w:p>
+      <w:pPr>
+        <w:numPr>
+          <w:ilvl w:val="0"/>
+          <w:numId w:val="42"/>
+        </w:numPr>
+        <w:spacing w:before="100" w:beforeAutospacing="1" w:after="100" w:afterAutospacing="1"/>
+      </w:pPr>
+      <w:r>
+        <w:rPr>
+          <w:b/>
+          <w:bCs/>
+        </w:rPr>
+        <w:t>Flagstaff Retail Store:</w:t>
+      </w:r>
+      <w:r>
+        <w:t xml:space="preserve"> Retail network</w:t>
+      </w:r>
+      <w:r>
+        <w:t xml:space="preserve"> – </w:t>
+      </w:r>
+      <w:bookmarkStart w:id="0" w:name="_GoBack"/>
+      <w:r>
+        <w:rPr>
+          <w:b/>
+        </w:rPr>
+        <w:t>VLAN1</w:t>
+      </w:r>
+      <w:bookmarkEnd w:id="0"/>
+    </w:p>
+    <w:p>
+      <w:pPr>
+        <w:spacing w:before="100" w:beforeAutospacing="1" w:after="100" w:afterAutospacing="1"/>
+      </w:pPr>
+      <w:r>
+        <w:lastRenderedPageBreak/>
+        <w:t xml:space="preserve">Additional subnets reserved for future growth at these locations should remain documented in the addressing plan but </w:t>
+      </w:r>
+      <w:r>
+        <w:rPr>
+          <w:b/>
+          <w:bCs/>
+        </w:rPr>
+        <w:t>should not be assigned to router interfaces unless directed by a future Enterprise Change Request (ECR).</w:t>
+      </w:r>
+    </w:p>
+    <w:p>
+      <w:pPr>
+        <w:spacing w:before="100" w:beforeAutospacing="1" w:after="100" w:afterAutospacing="1"/>
+      </w:pPr>
+      <w:r>
+        <w:t xml:space="preserve">The </w:t>
+      </w:r>
+      <w:r>
+        <w:rPr>
+          <w:b/>
+          <w:bCs/>
+        </w:rPr>
+        <w:t>Phoenix Headquarters</w:t>
+      </w:r>
+      <w:r>
+        <w:t xml:space="preserve"> addressing tables include interface addressing for both currently implemented and planned networks. This provides a complete headquarters addressing framework and establishes the interface addressing conventions that will be used as the enterprise network expands.</w:t>
+      </w:r>
+    </w:p>
+    <w:p>
+      <w:pPr>
+        <w:spacing w:before="100" w:beforeAutospacing="1" w:after="100" w:afterAutospacing="1"/>
+      </w:pPr>
+      <w:r>
+        <w:rPr>
+          <w:b/>
+          <w:bCs/>
+        </w:rPr>
+        <w:t>Important:</w:t>
+      </w:r>
+      <w:r>
+        <w:t xml:space="preserve"> A subnet appearing in the Enterprise IP Addressing Plan does not authorize its implementation. Configure only the networks and interfaces specifically required by the applicable ECR.</w:t>
+      </w:r>
+    </w:p>
+    <w:p>
+      <w:pPr>
+        <w:pStyle w:val="Heading4"/>
+      </w:pPr>
+    </w:p>
+    <w:p>
+      <w:pPr>
+        <w:pStyle w:val="Heading4"/>
+      </w:pPr>
+    </w:p>
+    <w:p>
+      <w:pPr>
+        <w:pStyle w:val="Heading4"/>
+      </w:pPr>
+    </w:p>
+    <w:p>
+      <w:pPr>
         <w:pStyle w:val="Heading4"/>
       </w:pPr>
       <w:r>
@@ -9690,6 +9864,7 @@
           <w:sz w:val="27"/>
           <w:szCs w:val="27"/>
         </w:rPr>
+        <w:lastRenderedPageBreak/>
         <w:t>TUC-R2 – Future Interface IP Addressing</w:t>
       </w:r>
     </w:p>
@@ -10479,7 +10654,6 @@
           <w:sz w:val="26"/>
           <w:szCs w:val="26"/>
         </w:rPr>
-        <w:lastRenderedPageBreak/>
         <w:t>Tucson End Devices</w:t>
       </w:r>
     </w:p>
@@ -10537,6 +10711,7 @@
                 <w:sz w:val="28"/>
                 <w:szCs w:val="28"/>
               </w:rPr>
+              <w:lastRenderedPageBreak/>
               <w:t>Department</w:t>
             </w:r>
           </w:p>
@@ -11411,7 +11586,6 @@
                 <w:sz w:val="28"/>
                 <w:szCs w:val="28"/>
               </w:rPr>
-              <w:lastRenderedPageBreak/>
               <w:t>Interface</w:t>
             </w:r>
           </w:p>
@@ -11620,6 +11794,7 @@
           <w:sz w:val="26"/>
           <w:szCs w:val="26"/>
         </w:rPr>
+        <w:lastRenderedPageBreak/>
         <w:t>Flagstaff End Devices</w:t>
       </w:r>
     </w:p>
@@ -12056,7 +12231,7 @@
       </w:pPr>
       <w:r>
         <w:pict>
-          <v:rect id="_x0000_i1045" style="width:468pt;height:1.5pt" o:hralign="center" o:hrstd="t" o:hrnoshade="t" o:hr="t" fillcolor="#4e6128 [1606]" stroked="f"/>
+          <v:rect id="_x0000_i1041" style="width:468pt;height:1.5pt" o:hralign="center" o:hrstd="t" o:hrnoshade="t" o:hr="t" fillcolor="#4e6128 [1606]" stroked="f"/>
         </w:pict>
       </w:r>
     </w:p>
@@ -12097,7 +12272,7 @@
           <w:color w:val="4F6228" w:themeColor="accent3" w:themeShade="80"/>
         </w:rPr>
         <w:pict>
-          <v:rect id="_x0000_i1046" style="width:468pt;height:2pt" o:hralign="center" o:hrstd="t" o:hrnoshade="t" o:hr="t" fillcolor="#484329 [814]" stroked="f"/>
+          <v:rect id="_x0000_i1042" style="width:468pt;height:2pt" o:hralign="center" o:hrstd="t" o:hrnoshade="t" o:hr="t" fillcolor="#484329 [814]" stroked="f"/>
         </w:pict>
       </w:r>
     </w:p>
@@ -12134,7 +12309,7 @@
       </w:pPr>
       <w:r>
         <w:pict>
-          <v:rect id="_x0000_i1042" style="width:468pt;height:1.5pt" o:hralign="center" o:hrstd="t" o:hrnoshade="t" o:hr="t" fillcolor="#974706 [1609]" stroked="f"/>
+          <v:rect id="_x0000_i1043" style="width:468pt;height:1.5pt" o:hralign="center" o:hrstd="t" o:hrnoshade="t" o:hr="t" fillcolor="#974706 [1609]" stroked="f"/>
         </w:pict>
       </w:r>
     </w:p>
@@ -12143,7 +12318,6 @@
         <w:pStyle w:val="Heading3"/>
       </w:pPr>
       <w:r>
-        <w:lastRenderedPageBreak/>
         <w:t>ECR-006 – DHCP and Stateless DHCPv6 Addressing Update</w:t>
       </w:r>
     </w:p>
@@ -12180,6 +12354,7 @@
         <w:spacing w:before="100" w:beforeAutospacing="1" w:after="100" w:afterAutospacing="1"/>
       </w:pPr>
       <w:r>
+        <w:lastRenderedPageBreak/>
         <w:t xml:space="preserve">Record the assigned addressing for the end devices at </w:t>
       </w:r>
       <w:r>
@@ -12838,7 +13013,6 @@
                 <w:sz w:val="28"/>
                 <w:szCs w:val="28"/>
               </w:rPr>
-              <w:lastRenderedPageBreak/>
               <w:t>Device</w:t>
             </w:r>
           </w:p>
@@ -13084,6 +13258,7 @@
               <w:jc w:val="center"/>
             </w:pPr>
             <w:r>
+              <w:lastRenderedPageBreak/>
               <w:t>PC-WH3</w:t>
             </w:r>
           </w:p>
@@ -13476,7 +13651,7 @@
           <w:szCs w:val="30"/>
         </w:rPr>
         <w:pict>
-          <v:rect id="_x0000_i1043" style="width:468pt;height:1.5pt" o:hralign="center" o:hrstd="t" o:hrnoshade="t" o:hr="t" fillcolor="#974706 [1609]" stroked="f"/>
+          <v:rect id="_x0000_i1044" style="width:468pt;height:1.5pt" o:hralign="center" o:hrstd="t" o:hrnoshade="t" o:hr="t" fillcolor="#974706 [1609]" stroked="f"/>
         </w:pict>
       </w:r>
     </w:p>
@@ -13553,7 +13728,6 @@
           <w:b/>
           <w:bCs/>
         </w:rPr>
-        <w:lastRenderedPageBreak/>
         <w:t>Do not modify the original Phoenix Headquarters router addressing tables.</w:t>
       </w:r>
       <w:r>
@@ -13565,6 +13739,7 @@
         <w:pStyle w:val="Heading4"/>
       </w:pPr>
       <w:r>
+        <w:lastRenderedPageBreak/>
         <w:t>Phoenix Headquarters – HSRPv2 Updated IPv4 Addressing</w:t>
       </w:r>
     </w:p>
@@ -14139,7 +14314,6 @@
         <w:rPr>
           <w:bCs/>
         </w:rPr>
-        <w:lastRenderedPageBreak/>
         <w:t>HQ-R2 is introduced during ECR-008 and was not part of the original Enterprise Interface Addressing Plan. Complete this table only after the HQ-R2 configuration has been successfully implemented and validated.</w:t>
       </w:r>
     </w:p>
@@ -14215,6 +14389,7 @@
                 <w:sz w:val="28"/>
                 <w:szCs w:val="28"/>
               </w:rPr>
+              <w:lastRenderedPageBreak/>
               <w:t>Interface</w:t>
             </w:r>
           </w:p>
@@ -14841,7 +15016,6 @@
         <w:spacing w:before="100" w:beforeAutospacing="1" w:after="100" w:afterAutospacing="1"/>
       </w:pPr>
       <w:r>
-        <w:lastRenderedPageBreak/>
         <w:t xml:space="preserve">After successfully implementing HSRPv2, verify the IPv4 default gateway in use by each designated Phoenix Headquarters end device. Each end device should use the </w:t>
       </w:r>
       <w:r>
@@ -14922,6 +15096,7 @@
                 <w:sz w:val="28"/>
                 <w:szCs w:val="28"/>
               </w:rPr>
+              <w:lastRenderedPageBreak/>
               <w:t>Device</w:t>
             </w:r>
           </w:p>
@@ -15059,6 +15234,7 @@
               <w14:uncheckedState w14:val="2610" w14:font="MS Gothic"/>
             </w14:checkbox>
           </w:sdtPr>
+          <w:sdtEndPr/>
           <w:sdtContent>
             <w:tc>
               <w:tcPr>
@@ -15128,6 +15304,7 @@
               <w14:uncheckedState w14:val="2610" w14:font="MS Gothic"/>
             </w14:checkbox>
           </w:sdtPr>
+          <w:sdtEndPr/>
           <w:sdtContent>
             <w:tc>
               <w:tcPr>
@@ -15197,6 +15374,7 @@
               <w14:uncheckedState w14:val="2610" w14:font="MS Gothic"/>
             </w14:checkbox>
           </w:sdtPr>
+          <w:sdtEndPr/>
           <w:sdtContent>
             <w:tc>
               <w:tcPr>
@@ -15266,6 +15444,7 @@
               <w14:uncheckedState w14:val="2610" w14:font="MS Gothic"/>
             </w14:checkbox>
           </w:sdtPr>
+          <w:sdtEndPr/>
           <w:sdtContent>
             <w:tc>
               <w:tcPr>
@@ -15335,6 +15514,7 @@
               <w14:uncheckedState w14:val="2610" w14:font="MS Gothic"/>
             </w14:checkbox>
           </w:sdtPr>
+          <w:sdtEndPr/>
           <w:sdtContent>
             <w:tc>
               <w:tcPr>
@@ -15378,7 +15558,7 @@
           <w:szCs w:val="30"/>
         </w:rPr>
         <w:pict>
-          <v:rect id="_x0000_i1044" style="width:468pt;height:1.5pt" o:hralign="center" o:hrstd="t" o:hrnoshade="t" o:hr="t" fillcolor="#974706 [1609]" stroked="f"/>
+          <v:rect id="_x0000_i1045" style="width:468pt;height:1.5pt" o:hralign="center" o:hrstd="t" o:hrnoshade="t" o:hr="t" fillcolor="#974706 [1609]" stroked="f"/>
         </w:pict>
       </w:r>
     </w:p>
@@ -15463,7 +15643,6 @@
                 <w:sz w:val="28"/>
                 <w:szCs w:val="28"/>
               </w:rPr>
-              <w:lastRenderedPageBreak/>
               <w:t>Interface</w:t>
             </w:r>
           </w:p>
@@ -15705,7 +15884,7 @@
           <w:szCs w:val="36"/>
         </w:rPr>
         <w:pict>
-          <v:rect id="_x0000_i1041" style="width:468pt;height:1.5pt" o:hralign="center" o:hrstd="t" o:hrnoshade="t" o:hr="t" fillcolor="#974706 [1609]" stroked="f"/>
+          <v:rect id="_x0000_i1046" style="width:468pt;height:1.5pt" o:hralign="center" o:hrstd="t" o:hrnoshade="t" o:hr="t" fillcolor="#974706 [1609]" stroked="f"/>
         </w:pict>
       </w:r>
       <w:r>
@@ -17070,6 +17249,155 @@
     </w:lvl>
   </w:abstractNum>
   <w:abstractNum w:abstractNumId="16" w15:restartNumberingAfterBreak="0">
+    <w:nsid w:val="286D12F0"/>
+    <w:multiLevelType w:val="multilevel"/>
+    <w:tmpl w:val="44BE80EC"/>
+    <w:lvl w:ilvl="0">
+      <w:start w:val="1"/>
+      <w:numFmt w:val="bullet"/>
+      <w:lvlText w:val=""/>
+      <w:lvlJc w:val="left"/>
+      <w:pPr>
+        <w:tabs>
+          <w:tab w:val="num" w:pos="720"/>
+        </w:tabs>
+        <w:ind w:left="720" w:hanging="360"/>
+      </w:pPr>
+      <w:rPr>
+        <w:rFonts w:ascii="Symbol" w:hAnsi="Symbol" w:hint="default"/>
+        <w:sz w:val="20"/>
+      </w:rPr>
+    </w:lvl>
+    <w:lvl w:ilvl="1" w:tentative="1">
+      <w:start w:val="1"/>
+      <w:numFmt w:val="bullet"/>
+      <w:lvlText w:val="o"/>
+      <w:lvlJc w:val="left"/>
+      <w:pPr>
+        <w:tabs>
+          <w:tab w:val="num" w:pos="1440"/>
+        </w:tabs>
+        <w:ind w:left="1440" w:hanging="360"/>
+      </w:pPr>
+      <w:rPr>
+        <w:rFonts w:ascii="Courier New" w:hAnsi="Courier New" w:hint="default"/>
+        <w:sz w:val="20"/>
+      </w:rPr>
+    </w:lvl>
+    <w:lvl w:ilvl="2" w:tentative="1">
+      <w:start w:val="1"/>
+      <w:numFmt w:val="bullet"/>
+      <w:lvlText w:val=""/>
+      <w:lvlJc w:val="left"/>
+      <w:pPr>
+        <w:tabs>
+          <w:tab w:val="num" w:pos="2160"/>
+        </w:tabs>
+        <w:ind w:left="2160" w:hanging="360"/>
+      </w:pPr>
+      <w:rPr>
+        <w:rFonts w:ascii="Wingdings" w:hAnsi="Wingdings" w:hint="default"/>
+        <w:sz w:val="20"/>
+      </w:rPr>
+    </w:lvl>
+    <w:lvl w:ilvl="3" w:tentative="1">
+      <w:start w:val="1"/>
+      <w:numFmt w:val="bullet"/>
+      <w:lvlText w:val=""/>
+      <w:lvlJc w:val="left"/>
+      <w:pPr>
+        <w:tabs>
+          <w:tab w:val="num" w:pos="2880"/>
+        </w:tabs>
+        <w:ind w:left="2880" w:hanging="360"/>
+      </w:pPr>
+      <w:rPr>
+        <w:rFonts w:ascii="Wingdings" w:hAnsi="Wingdings" w:hint="default"/>
+        <w:sz w:val="20"/>
+      </w:rPr>
+    </w:lvl>
+    <w:lvl w:ilvl="4" w:tentative="1">
+      <w:start w:val="1"/>
+      <w:numFmt w:val="bullet"/>
+      <w:lvlText w:val=""/>
+      <w:lvlJc w:val="left"/>
+      <w:pPr>
+        <w:tabs>
+          <w:tab w:val="num" w:pos="3600"/>
+        </w:tabs>
+        <w:ind w:left="3600" w:hanging="360"/>
+      </w:pPr>
+      <w:rPr>
+        <w:rFonts w:ascii="Wingdings" w:hAnsi="Wingdings" w:hint="default"/>
+        <w:sz w:val="20"/>
+      </w:rPr>
+    </w:lvl>
+    <w:lvl w:ilvl="5" w:tentative="1">
+      <w:start w:val="1"/>
+      <w:numFmt w:val="bullet"/>
+      <w:lvlText w:val=""/>
+      <w:lvlJc w:val="left"/>
+      <w:pPr>
+        <w:tabs>
+          <w:tab w:val="num" w:pos="4320"/>
+        </w:tabs>
+        <w:ind w:left="4320" w:hanging="360"/>
+      </w:pPr>
+      <w:rPr>
+        <w:rFonts w:ascii="Wingdings" w:hAnsi="Wingdings" w:hint="default"/>
+        <w:sz w:val="20"/>
+      </w:rPr>
+    </w:lvl>
+    <w:lvl w:ilvl="6" w:tentative="1">
+      <w:start w:val="1"/>
+      <w:numFmt w:val="bullet"/>
+      <w:lvlText w:val=""/>
+      <w:lvlJc w:val="left"/>
+      <w:pPr>
+        <w:tabs>
+          <w:tab w:val="num" w:pos="5040"/>
+        </w:tabs>
+        <w:ind w:left="5040" w:hanging="360"/>
+      </w:pPr>
+      <w:rPr>
+        <w:rFonts w:ascii="Wingdings" w:hAnsi="Wingdings" w:hint="default"/>
+        <w:sz w:val="20"/>
+      </w:rPr>
+    </w:lvl>
+    <w:lvl w:ilvl="7" w:tentative="1">
+      <w:start w:val="1"/>
+      <w:numFmt w:val="bullet"/>
+      <w:lvlText w:val=""/>
+      <w:lvlJc w:val="left"/>
+      <w:pPr>
+        <w:tabs>
+          <w:tab w:val="num" w:pos="5760"/>
+        </w:tabs>
+        <w:ind w:left="5760" w:hanging="360"/>
+      </w:pPr>
+      <w:rPr>
+        <w:rFonts w:ascii="Wingdings" w:hAnsi="Wingdings" w:hint="default"/>
+        <w:sz w:val="20"/>
+      </w:rPr>
+    </w:lvl>
+    <w:lvl w:ilvl="8" w:tentative="1">
+      <w:start w:val="1"/>
+      <w:numFmt w:val="bullet"/>
+      <w:lvlText w:val=""/>
+      <w:lvlJc w:val="left"/>
+      <w:pPr>
+        <w:tabs>
+          <w:tab w:val="num" w:pos="6480"/>
+        </w:tabs>
+        <w:ind w:left="6480" w:hanging="360"/>
+      </w:pPr>
+      <w:rPr>
+        <w:rFonts w:ascii="Wingdings" w:hAnsi="Wingdings" w:hint="default"/>
+        <w:sz w:val="20"/>
+      </w:rPr>
+    </w:lvl>
+  </w:abstractNum>
+  <w:abstractNum w:abstractNumId="17" w15:restartNumberingAfterBreak="0">
     <w:nsid w:val="2D4D25DE"/>
     <w:multiLevelType w:val="multilevel"/>
     <w:tmpl w:val="FD88EAFC"/>
@@ -17218,7 +17546,7 @@
       </w:rPr>
     </w:lvl>
   </w:abstractNum>
-  <w:abstractNum w:abstractNumId="17" w15:restartNumberingAfterBreak="0">
+  <w:abstractNum w:abstractNumId="18" w15:restartNumberingAfterBreak="0">
     <w:nsid w:val="2D537506"/>
     <w:multiLevelType w:val="multilevel"/>
     <w:tmpl w:val="749E4718"/>
@@ -17367,7 +17695,7 @@
       </w:rPr>
     </w:lvl>
   </w:abstractNum>
-  <w:abstractNum w:abstractNumId="18" w15:restartNumberingAfterBreak="0">
+  <w:abstractNum w:abstractNumId="19" w15:restartNumberingAfterBreak="0">
     <w:nsid w:val="2E261449"/>
     <w:multiLevelType w:val="multilevel"/>
     <w:tmpl w:val="D42C3430"/>
@@ -17516,7 +17844,7 @@
       </w:rPr>
     </w:lvl>
   </w:abstractNum>
-  <w:abstractNum w:abstractNumId="19" w15:restartNumberingAfterBreak="0">
+  <w:abstractNum w:abstractNumId="20" w15:restartNumberingAfterBreak="0">
     <w:nsid w:val="2E646FF7"/>
     <w:multiLevelType w:val="multilevel"/>
     <w:tmpl w:val="4FBC5F92"/>
@@ -17665,7 +17993,7 @@
       </w:rPr>
     </w:lvl>
   </w:abstractNum>
-  <w:abstractNum w:abstractNumId="20" w15:restartNumberingAfterBreak="0">
+  <w:abstractNum w:abstractNumId="21" w15:restartNumberingAfterBreak="0">
     <w:nsid w:val="3505326E"/>
     <w:multiLevelType w:val="multilevel"/>
     <w:tmpl w:val="CD9A4498"/>
@@ -17814,7 +18142,7 @@
       </w:rPr>
     </w:lvl>
   </w:abstractNum>
-  <w:abstractNum w:abstractNumId="21" w15:restartNumberingAfterBreak="0">
+  <w:abstractNum w:abstractNumId="22" w15:restartNumberingAfterBreak="0">
     <w:nsid w:val="374C1C4D"/>
     <w:multiLevelType w:val="multilevel"/>
     <w:tmpl w:val="EEB2E986"/>
@@ -17963,7 +18291,7 @@
       </w:rPr>
     </w:lvl>
   </w:abstractNum>
-  <w:abstractNum w:abstractNumId="22" w15:restartNumberingAfterBreak="0">
+  <w:abstractNum w:abstractNumId="23" w15:restartNumberingAfterBreak="0">
     <w:nsid w:val="3B364B33"/>
     <w:multiLevelType w:val="multilevel"/>
     <w:tmpl w:val="57721A44"/>
@@ -18112,7 +18440,7 @@
       </w:rPr>
     </w:lvl>
   </w:abstractNum>
-  <w:abstractNum w:abstractNumId="23" w15:restartNumberingAfterBreak="0">
+  <w:abstractNum w:abstractNumId="24" w15:restartNumberingAfterBreak="0">
     <w:nsid w:val="3F0271A1"/>
     <w:multiLevelType w:val="multilevel"/>
     <w:tmpl w:val="D5C2F1F2"/>
@@ -18261,7 +18589,7 @@
       </w:rPr>
     </w:lvl>
   </w:abstractNum>
-  <w:abstractNum w:abstractNumId="24" w15:restartNumberingAfterBreak="0">
+  <w:abstractNum w:abstractNumId="25" w15:restartNumberingAfterBreak="0">
     <w:nsid w:val="3F7A783A"/>
     <w:multiLevelType w:val="multilevel"/>
     <w:tmpl w:val="50C897FA"/>
@@ -18410,7 +18738,7 @@
       </w:rPr>
     </w:lvl>
   </w:abstractNum>
-  <w:abstractNum w:abstractNumId="25" w15:restartNumberingAfterBreak="0">
+  <w:abstractNum w:abstractNumId="26" w15:restartNumberingAfterBreak="0">
     <w:nsid w:val="4B0410E2"/>
     <w:multiLevelType w:val="multilevel"/>
     <w:tmpl w:val="B33A50DC"/>
@@ -18559,7 +18887,7 @@
       </w:rPr>
     </w:lvl>
   </w:abstractNum>
-  <w:abstractNum w:abstractNumId="26" w15:restartNumberingAfterBreak="0">
+  <w:abstractNum w:abstractNumId="27" w15:restartNumberingAfterBreak="0">
     <w:nsid w:val="4C8B22B0"/>
     <w:multiLevelType w:val="multilevel"/>
     <w:tmpl w:val="E00010F2"/>
@@ -18708,7 +19036,7 @@
       </w:rPr>
     </w:lvl>
   </w:abstractNum>
-  <w:abstractNum w:abstractNumId="27" w15:restartNumberingAfterBreak="0">
+  <w:abstractNum w:abstractNumId="28" w15:restartNumberingAfterBreak="0">
     <w:nsid w:val="552C39EB"/>
     <w:multiLevelType w:val="multilevel"/>
     <w:tmpl w:val="33C09294"/>
@@ -18857,7 +19185,7 @@
       </w:rPr>
     </w:lvl>
   </w:abstractNum>
-  <w:abstractNum w:abstractNumId="28" w15:restartNumberingAfterBreak="0">
+  <w:abstractNum w:abstractNumId="29" w15:restartNumberingAfterBreak="0">
     <w:nsid w:val="5E8601BB"/>
     <w:multiLevelType w:val="multilevel"/>
     <w:tmpl w:val="FD3EF762"/>
@@ -19006,7 +19334,7 @@
       </w:rPr>
     </w:lvl>
   </w:abstractNum>
-  <w:abstractNum w:abstractNumId="29" w15:restartNumberingAfterBreak="0">
+  <w:abstractNum w:abstractNumId="30" w15:restartNumberingAfterBreak="0">
     <w:nsid w:val="64DC27D6"/>
     <w:multiLevelType w:val="multilevel"/>
     <w:tmpl w:val="EE524664"/>
@@ -19155,7 +19483,7 @@
       </w:rPr>
     </w:lvl>
   </w:abstractNum>
-  <w:abstractNum w:abstractNumId="30" w15:restartNumberingAfterBreak="0">
+  <w:abstractNum w:abstractNumId="31" w15:restartNumberingAfterBreak="0">
     <w:nsid w:val="6A78532F"/>
     <w:multiLevelType w:val="multilevel"/>
     <w:tmpl w:val="D8BC3F62"/>
@@ -19304,7 +19632,7 @@
       </w:rPr>
     </w:lvl>
   </w:abstractNum>
-  <w:abstractNum w:abstractNumId="31" w15:restartNumberingAfterBreak="0">
+  <w:abstractNum w:abstractNumId="32" w15:restartNumberingAfterBreak="0">
     <w:nsid w:val="6B5B48E1"/>
     <w:multiLevelType w:val="multilevel"/>
     <w:tmpl w:val="5DFE47E4"/>
@@ -19453,7 +19781,7 @@
       </w:rPr>
     </w:lvl>
   </w:abstractNum>
-  <w:abstractNum w:abstractNumId="32" w15:restartNumberingAfterBreak="0">
+  <w:abstractNum w:abstractNumId="33" w15:restartNumberingAfterBreak="0">
     <w:nsid w:val="70000FD2"/>
     <w:multiLevelType w:val="multilevel"/>
     <w:tmpl w:val="22CEB92E"/>
@@ -19602,7 +19930,7 @@
       </w:rPr>
     </w:lvl>
   </w:abstractNum>
-  <w:abstractNum w:abstractNumId="33" w15:restartNumberingAfterBreak="0">
+  <w:abstractNum w:abstractNumId="34" w15:restartNumberingAfterBreak="0">
     <w:nsid w:val="71092913"/>
     <w:multiLevelType w:val="multilevel"/>
     <w:tmpl w:val="DB9EECDE"/>
@@ -19751,7 +20079,7 @@
       </w:rPr>
     </w:lvl>
   </w:abstractNum>
-  <w:abstractNum w:abstractNumId="34" w15:restartNumberingAfterBreak="0">
+  <w:abstractNum w:abstractNumId="35" w15:restartNumberingAfterBreak="0">
     <w:nsid w:val="71DA0FEE"/>
     <w:multiLevelType w:val="multilevel"/>
     <w:tmpl w:val="C2C45730"/>
@@ -19900,7 +20228,7 @@
       </w:rPr>
     </w:lvl>
   </w:abstractNum>
-  <w:abstractNum w:abstractNumId="35" w15:restartNumberingAfterBreak="0">
+  <w:abstractNum w:abstractNumId="36" w15:restartNumberingAfterBreak="0">
     <w:nsid w:val="725A49C3"/>
     <w:multiLevelType w:val="multilevel"/>
     <w:tmpl w:val="24FAD010"/>
@@ -20049,7 +20377,7 @@
       </w:rPr>
     </w:lvl>
   </w:abstractNum>
-  <w:abstractNum w:abstractNumId="36" w15:restartNumberingAfterBreak="0">
+  <w:abstractNum w:abstractNumId="37" w15:restartNumberingAfterBreak="0">
     <w:nsid w:val="776D6268"/>
     <w:multiLevelType w:val="multilevel"/>
     <w:tmpl w:val="0562E48A"/>
@@ -20198,7 +20526,7 @@
       </w:rPr>
     </w:lvl>
   </w:abstractNum>
-  <w:abstractNum w:abstractNumId="37" w15:restartNumberingAfterBreak="0">
+  <w:abstractNum w:abstractNumId="38" w15:restartNumberingAfterBreak="0">
     <w:nsid w:val="77E9709F"/>
     <w:multiLevelType w:val="multilevel"/>
     <w:tmpl w:val="AD9CC4BA"/>
@@ -20347,7 +20675,7 @@
       </w:rPr>
     </w:lvl>
   </w:abstractNum>
-  <w:abstractNum w:abstractNumId="38" w15:restartNumberingAfterBreak="0">
+  <w:abstractNum w:abstractNumId="39" w15:restartNumberingAfterBreak="0">
     <w:nsid w:val="7A085095"/>
     <w:multiLevelType w:val="multilevel"/>
     <w:tmpl w:val="6280453C"/>
@@ -20496,7 +20824,7 @@
       </w:rPr>
     </w:lvl>
   </w:abstractNum>
-  <w:abstractNum w:abstractNumId="39" w15:restartNumberingAfterBreak="0">
+  <w:abstractNum w:abstractNumId="40" w15:restartNumberingAfterBreak="0">
     <w:nsid w:val="7AA438BF"/>
     <w:multiLevelType w:val="multilevel"/>
     <w:tmpl w:val="5E8A5098"/>
@@ -20645,7 +20973,7 @@
       </w:rPr>
     </w:lvl>
   </w:abstractNum>
-  <w:abstractNum w:abstractNumId="40" w15:restartNumberingAfterBreak="0">
+  <w:abstractNum w:abstractNumId="41" w15:restartNumberingAfterBreak="0">
     <w:nsid w:val="7DED33D0"/>
     <w:multiLevelType w:val="multilevel"/>
     <w:tmpl w:val="F97EDEB8"/>
@@ -20825,46 +21153,46 @@
     <w:abstractNumId w:val="9"/>
   </w:num>
   <w:num w:numId="11">
-    <w:abstractNumId w:val="21"/>
+    <w:abstractNumId w:val="22"/>
   </w:num>
   <w:num w:numId="12">
-    <w:abstractNumId w:val="24"/>
+    <w:abstractNumId w:val="25"/>
   </w:num>
   <w:num w:numId="13">
-    <w:abstractNumId w:val="40"/>
+    <w:abstractNumId w:val="41"/>
   </w:num>
   <w:num w:numId="14">
-    <w:abstractNumId w:val="29"/>
+    <w:abstractNumId w:val="30"/>
   </w:num>
   <w:num w:numId="15">
-    <w:abstractNumId w:val="30"/>
+    <w:abstractNumId w:val="31"/>
   </w:num>
   <w:num w:numId="16">
     <w:abstractNumId w:val="10"/>
   </w:num>
   <w:num w:numId="17">
-    <w:abstractNumId w:val="25"/>
+    <w:abstractNumId w:val="26"/>
   </w:num>
   <w:num w:numId="18">
-    <w:abstractNumId w:val="18"/>
+    <w:abstractNumId w:val="19"/>
   </w:num>
   <w:num w:numId="19">
-    <w:abstractNumId w:val="19"/>
+    <w:abstractNumId w:val="20"/>
   </w:num>
   <w:num w:numId="20">
-    <w:abstractNumId w:val="39"/>
+    <w:abstractNumId w:val="40"/>
   </w:num>
   <w:num w:numId="21">
-    <w:abstractNumId w:val="20"/>
+    <w:abstractNumId w:val="21"/>
   </w:num>
   <w:num w:numId="22">
-    <w:abstractNumId w:val="35"/>
+    <w:abstractNumId w:val="36"/>
   </w:num>
   <w:num w:numId="23">
-    <w:abstractNumId w:val="22"/>
+    <w:abstractNumId w:val="23"/>
   </w:num>
   <w:num w:numId="24">
-    <w:abstractNumId w:val="33"/>
+    <w:abstractNumId w:val="34"/>
   </w:num>
   <w:num w:numId="25">
     <w:abstractNumId w:val="11"/>
@@ -20876,46 +21204,49 @@
     <w:abstractNumId w:val="15"/>
   </w:num>
   <w:num w:numId="28">
-    <w:abstractNumId w:val="23"/>
+    <w:abstractNumId w:val="24"/>
   </w:num>
   <w:num w:numId="29">
-    <w:abstractNumId w:val="36"/>
+    <w:abstractNumId w:val="37"/>
   </w:num>
   <w:num w:numId="30">
     <w:abstractNumId w:val="13"/>
   </w:num>
   <w:num w:numId="31">
-    <w:abstractNumId w:val="37"/>
+    <w:abstractNumId w:val="38"/>
   </w:num>
   <w:num w:numId="32">
-    <w:abstractNumId w:val="26"/>
+    <w:abstractNumId w:val="27"/>
   </w:num>
   <w:num w:numId="33">
-    <w:abstractNumId w:val="17"/>
+    <w:abstractNumId w:val="18"/>
   </w:num>
   <w:num w:numId="34">
-    <w:abstractNumId w:val="31"/>
+    <w:abstractNumId w:val="32"/>
   </w:num>
   <w:num w:numId="35">
     <w:abstractNumId w:val="12"/>
   </w:num>
   <w:num w:numId="36">
-    <w:abstractNumId w:val="32"/>
+    <w:abstractNumId w:val="33"/>
   </w:num>
   <w:num w:numId="37">
+    <w:abstractNumId w:val="29"/>
+  </w:num>
+  <w:num w:numId="38">
+    <w:abstractNumId w:val="39"/>
+  </w:num>
+  <w:num w:numId="39">
     <w:abstractNumId w:val="28"/>
   </w:num>
-  <w:num w:numId="38">
-    <w:abstractNumId w:val="38"/>
-  </w:num>
-  <w:num w:numId="39">
-    <w:abstractNumId w:val="27"/>
-  </w:num>
   <w:num w:numId="40">
-    <w:abstractNumId w:val="16"/>
+    <w:abstractNumId w:val="17"/>
   </w:num>
   <w:num w:numId="41">
-    <w:abstractNumId w:val="34"/>
+    <w:abstractNumId w:val="35"/>
+  </w:num>
+  <w:num w:numId="42">
+    <w:abstractNumId w:val="16"/>
   </w:num>
 </w:numbering>
 </file>
@@ -32795,7 +33126,7 @@
 </file>
 
 <file path=customXml/itemProps1.xml><?xml version="1.0" encoding="utf-8"?>
-<ds:datastoreItem xmlns:ds="http://schemas.openxmlformats.org/officeDocument/2006/customXml" ds:itemID="{2C16AA9A-7BB2-4CD4-9A6D-B05934B9F89B}">
+<ds:datastoreItem xmlns:ds="http://schemas.openxmlformats.org/officeDocument/2006/customXml" ds:itemID="{25BAB6F5-6491-4212-A182-0ED4AB18D8F7}">
   <ds:schemaRefs>
     <ds:schemaRef ds:uri="http://schemas.openxmlformats.org/officeDocument/2006/bibliography"/>
   </ds:schemaRefs>

</xml_diff>

<commit_message>
Uploaded the updated Addressing Plan Document
</commit_message>
<xml_diff>
--- a/downloads/SOE - Enterprise_IP_Address_Plan.docx
+++ b/downloads/SOE - Enterprise_IP_Address_Plan.docx
@@ -1,6 +1,6 @@
 
 <file path=word/document.xml><?xml version="1.0" encoding="utf-8"?>
-<w:document xmlns:wpc="http://schemas.microsoft.com/office/word/2010/wordprocessingCanvas" xmlns:mc="http://schemas.openxmlformats.org/markup-compatibility/2006" xmlns:o="urn:schemas-microsoft-com:office:office" xmlns:r="http://schemas.openxmlformats.org/officeDocument/2006/relationships" xmlns:m="http://schemas.openxmlformats.org/officeDocument/2006/math" xmlns:v="urn:schemas-microsoft-com:vml" xmlns:wp14="http://schemas.microsoft.com/office/word/2010/wordprocessingDrawing" xmlns:wp="http://schemas.openxmlformats.org/drawingml/2006/wordprocessingDrawing" xmlns:w10="urn:schemas-microsoft-com:office:word" xmlns:w="http://schemas.openxmlformats.org/wordprocessingml/2006/main" xmlns:w14="http://schemas.microsoft.com/office/word/2010/wordml" xmlns:w15="http://schemas.microsoft.com/office/word/2012/wordml" xmlns:wpg="http://schemas.microsoft.com/office/word/2010/wordprocessingGroup" xmlns:wpi="http://schemas.microsoft.com/office/word/2010/wordprocessingInk" xmlns:wne="http://schemas.microsoft.com/office/word/2006/wordml" xmlns:wps="http://schemas.microsoft.com/office/word/2010/wordprocessingShape" mc:Ignorable="w14 w15 wp14">
+<w:document xmlns:wpc="http://schemas.microsoft.com/office/word/2010/wordprocessingCanvas" xmlns:cx="http://schemas.microsoft.com/office/drawing/2014/chartex" xmlns:cx1="http://schemas.microsoft.com/office/drawing/2015/9/8/chartex" xmlns:cx2="http://schemas.microsoft.com/office/drawing/2015/10/21/chartex" xmlns:cx3="http://schemas.microsoft.com/office/drawing/2016/5/9/chartex" xmlns:cx4="http://schemas.microsoft.com/office/drawing/2016/5/10/chartex" xmlns:cx5="http://schemas.microsoft.com/office/drawing/2016/5/11/chartex" xmlns:cx6="http://schemas.microsoft.com/office/drawing/2016/5/12/chartex" xmlns:cx7="http://schemas.microsoft.com/office/drawing/2016/5/13/chartex" xmlns:cx8="http://schemas.microsoft.com/office/drawing/2016/5/14/chartex" xmlns:mc="http://schemas.openxmlformats.org/markup-compatibility/2006" xmlns:aink="http://schemas.microsoft.com/office/drawing/2016/ink" xmlns:am3d="http://schemas.microsoft.com/office/drawing/2017/model3d" xmlns:o="urn:schemas-microsoft-com:office:office" xmlns:oel="http://schemas.microsoft.com/office/2019/extlst" xmlns:r="http://schemas.openxmlformats.org/officeDocument/2006/relationships" xmlns:m="http://schemas.openxmlformats.org/officeDocument/2006/math" xmlns:v="urn:schemas-microsoft-com:vml" xmlns:wp14="http://schemas.microsoft.com/office/word/2010/wordprocessingDrawing" xmlns:wp="http://schemas.openxmlformats.org/drawingml/2006/wordprocessingDrawing" xmlns:w10="urn:schemas-microsoft-com:office:word" xmlns:w="http://schemas.openxmlformats.org/wordprocessingml/2006/main" xmlns:w14="http://schemas.microsoft.com/office/word/2010/wordml" xmlns:w15="http://schemas.microsoft.com/office/word/2012/wordml" xmlns:w16cex="http://schemas.microsoft.com/office/word/2018/wordml/cex" xmlns:w16cid="http://schemas.microsoft.com/office/word/2016/wordml/cid" xmlns:w16="http://schemas.microsoft.com/office/word/2018/wordml" xmlns:w16sdtdh="http://schemas.microsoft.com/office/word/2020/wordml/sdtdatahash" xmlns:w16se="http://schemas.microsoft.com/office/word/2015/wordml/symex" xmlns:wpg="http://schemas.microsoft.com/office/word/2010/wordprocessingGroup" xmlns:wpi="http://schemas.microsoft.com/office/word/2010/wordprocessingInk" xmlns:wne="http://schemas.microsoft.com/office/word/2006/wordml" xmlns:wps="http://schemas.microsoft.com/office/word/2010/wordprocessingShape" mc:Ignorable="w14 w15 w16se w16cid w16 w16cex w16sdtdh wp14">
   <w:body>
     <w:p>
       <w:pPr>
@@ -69,7 +69,7 @@
         <w:rPr>
           <w:rStyle w:val="BookTitle"/>
         </w:rPr>
-        <w:t xml:space="preserve"> (Answers)</w:t>
+        <w:t xml:space="preserve"> </w:t>
       </w:r>
     </w:p>
     <w:p>
@@ -226,21 +226,7 @@
           <w:b w:val="0"/>
         </w:rPr>
         <w:lastRenderedPageBreak/>
-        <w:t xml:space="preserve">VLSM allocation order. For IPv6, follow the enterprise </w:t>
-      </w:r>
-      <w:proofErr w:type="spellStart"/>
-      <w:r>
-        <w:rPr>
-          <w:b w:val="0"/>
-        </w:rPr>
-        <w:t>subnetting</w:t>
-      </w:r>
-      <w:proofErr w:type="spellEnd"/>
-      <w:r>
-        <w:rPr>
-          <w:b w:val="0"/>
-        </w:rPr>
-        <w:t xml:space="preserve"> standards defined in this document. </w:t>
+        <w:t xml:space="preserve">VLSM allocation order. For IPv6, follow the enterprise subnetting standards defined in this document. </w:t>
       </w:r>
       <w:r>
         <w:rPr>
@@ -264,7 +250,7 @@
         <w:rPr>
           <w:color w:val="4F6228" w:themeColor="accent3" w:themeShade="80"/>
         </w:rPr>
-        <w:pict>
+        <w:pict w14:anchorId="0EEDFA9F">
           <v:rect id="_x0000_i1025" style="width:468pt;height:2pt" o:hralign="center" o:hrstd="t" o:hrnoshade="t" o:hr="t" fillcolor="#4e6128 [1606]" stroked="f"/>
         </w:pict>
       </w:r>
@@ -368,15 +354,7 @@
         <w:spacing w:before="100" w:beforeAutospacing="1" w:after="100" w:afterAutospacing="1"/>
       </w:pPr>
       <w:r>
-        <w:t xml:space="preserve">Develop an enterprise IPv6 addressing plan using the </w:t>
-      </w:r>
-      <w:proofErr w:type="spellStart"/>
-      <w:r>
-        <w:t>subnetting</w:t>
-      </w:r>
-      <w:proofErr w:type="spellEnd"/>
-      <w:r>
-        <w:t xml:space="preserve"> standards defined in this document.</w:t>
+        <w:t>Develop an enterprise IPv6 addressing plan using the subnetting standards defined in this document.</w:t>
       </w:r>
     </w:p>
     <w:p>
@@ -384,15 +362,7 @@
         <w:pStyle w:val="Heading3"/>
       </w:pPr>
       <w:r>
-        <w:t xml:space="preserve">IPv6 Enterprise </w:t>
-      </w:r>
-      <w:proofErr w:type="spellStart"/>
-      <w:r>
-        <w:t>Subnetting</w:t>
-      </w:r>
-      <w:proofErr w:type="spellEnd"/>
-      <w:r>
-        <w:t xml:space="preserve"> Standards</w:t>
+        <w:t>IPv6 Enterprise Subnetting Standards</w:t>
       </w:r>
     </w:p>
     <w:p>
@@ -414,6 +384,7 @@
       <w:r>
         <w:t xml:space="preserve">The enterprise has been assigned the global unicast prefix </w:t>
       </w:r>
+      <w:proofErr w:type="gramStart"/>
       <w:r>
         <w:rPr>
           <w:b/>
@@ -433,23 +404,15 @@
           <w:b/>
           <w:bCs/>
         </w:rPr>
-        <w:t>001:</w:t>
-      </w:r>
-      <w:proofErr w:type="gramStart"/>
+        <w:t>001</w:t>
+      </w:r>
+      <w:proofErr w:type="gramEnd"/>
       <w:r>
         <w:rPr>
           <w:b/>
           <w:bCs/>
         </w:rPr>
-        <w:t>:/</w:t>
-      </w:r>
-      <w:proofErr w:type="gramEnd"/>
-      <w:r>
-        <w:rPr>
-          <w:b/>
-          <w:bCs/>
-        </w:rPr>
-        <w:t>48</w:t>
+        <w:t>::/48</w:t>
       </w:r>
       <w:r>
         <w:t xml:space="preserve">. </w:t>
@@ -759,7 +722,7 @@
         <w:rPr>
           <w:color w:val="4F6228" w:themeColor="accent3" w:themeShade="80"/>
         </w:rPr>
-        <w:pict>
+        <w:pict w14:anchorId="5AB46AEB">
           <v:rect id="_x0000_i1026" style="width:468pt;height:2pt" o:hralign="center" o:hrstd="t" o:hrnoshade="t" o:hr="t" fillcolor="#4e6128 [1606]" stroked="f"/>
         </w:pict>
       </w:r>
@@ -795,7 +758,7 @@
           <w:color w:val="4F6228" w:themeColor="accent3" w:themeShade="80"/>
         </w:rPr>
         <w:lastRenderedPageBreak/>
-        <w:pict>
+        <w:pict w14:anchorId="5676AC4F">
           <v:rect id="_x0000_i1027" style="width:468pt;height:2pt" o:hralign="center" o:hrstd="t" o:hrnoshade="t" o:hr="t" fillcolor="#484329 [814]" stroked="f"/>
         </w:pict>
       </w:r>
@@ -822,7 +785,7 @@
         <w:rPr>
           <w:color w:val="4F6228" w:themeColor="accent3" w:themeShade="80"/>
         </w:rPr>
-        <w:pict>
+        <w:pict w14:anchorId="21BD44F8">
           <v:rect id="_x0000_i1028" style="width:468pt;height:2pt" o:hralign="center" o:hrstd="t" o:hrnoshade="t" o:hr="t" fillcolor="#484329 [814]" stroked="f"/>
         </w:pict>
       </w:r>
@@ -1219,13 +1182,8 @@
             <w:hideMark/>
           </w:tcPr>
           <w:p>
-            <w:proofErr w:type="spellStart"/>
-            <w:r>
-              <w:t>IoT</w:t>
-            </w:r>
-            <w:proofErr w:type="spellEnd"/>
-            <w:r>
-              <w:t xml:space="preserve"> &amp; Security Systems</w:t>
+            <w:r>
+              <w:t>IoT &amp; Security Systems</w:t>
             </w:r>
           </w:p>
         </w:tc>
@@ -2308,7 +2266,7 @@
           <w:color w:val="4F6228" w:themeColor="accent3" w:themeShade="80"/>
         </w:rPr>
         <w:lastRenderedPageBreak/>
-        <w:pict>
+        <w:pict w14:anchorId="750B91A4">
           <v:rect id="_x0000_i1029" style="width:468pt;height:2pt" o:hralign="center" o:hrstd="t" o:hrnoshade="t" o:hr="t" fillcolor="#4e6128 [1606]" stroked="f"/>
         </w:pict>
       </w:r>
@@ -4393,8 +4351,8 @@
       </w:pPr>
       <w:r>
         <w:lastRenderedPageBreak/>
-        <w:pict>
-          <v:rect id="_x0000_i1030" style="width:468pt;height:1.5pt" o:hralign="center" o:hrstd="t" o:hrnoshade="t" o:hr="t" fillcolor="#4e6128 [1606]" stroked="f"/>
+        <w:pict w14:anchorId="57DF3F95">
+          <v:rect id="_x0000_i1031" style="width:468pt;height:1.5pt" o:hralign="center" o:hrstd="t" o:hrnoshade="t" o:hr="t" fillcolor="#4e6128 [1606]" stroked="f"/>
         </w:pict>
       </w:r>
     </w:p>
@@ -4441,8 +4399,8 @@
         <w:rPr>
           <w:color w:val="4F6228" w:themeColor="accent3" w:themeShade="80"/>
         </w:rPr>
-        <w:pict>
-          <v:rect id="_x0000_i1031" style="width:468pt;height:2pt" o:hralign="center" o:hrstd="t" o:hrnoshade="t" o:hr="t" fillcolor="#484329 [814]" stroked="f"/>
+        <w:pict w14:anchorId="2A970C79">
+          <v:rect id="_x0000_i1032" style="width:468pt;height:2pt" o:hralign="center" o:hrstd="t" o:hrnoshade="t" o:hr="t" fillcolor="#484329 [814]" stroked="f"/>
         </w:pict>
       </w:r>
     </w:p>
@@ -4477,8 +4435,8 @@
         <w:spacing w:before="100" w:beforeAutospacing="1"/>
       </w:pPr>
       <w:r>
-        <w:pict>
-          <v:rect id="_x0000_i1032" style="width:468pt;height:1.5pt" o:hralign="center" o:hrstd="t" o:hrnoshade="t" o:hr="t" fillcolor="#4e6128 [1606]" stroked="f"/>
+        <w:pict w14:anchorId="7FC65386">
+          <v:rect id="_x0000_i1033" style="width:468pt;height:1.5pt" o:hralign="center" o:hrstd="t" o:hrnoshade="t" o:hr="t" fillcolor="#4e6128 [1606]" stroked="f"/>
         </w:pict>
       </w:r>
     </w:p>
@@ -4690,8 +4648,8 @@
     </w:p>
     <w:p>
       <w:r>
-        <w:pict>
-          <v:rect id="_x0000_i1033" style="width:468pt;height:1.5pt" o:hralign="center" o:hrstd="t" o:hrnoshade="t" o:hr="t" fillcolor="#974706 [1609]" stroked="f"/>
+        <w:pict w14:anchorId="767F2626">
+          <v:rect id="_x0000_i1034" style="width:468pt;height:1.5pt" o:hralign="center" o:hrstd="t" o:hrnoshade="t" o:hr="t" fillcolor="#974706 [1609]" stroked="f"/>
         </w:pict>
       </w:r>
     </w:p>
@@ -4801,7 +4759,7 @@
           <w:b/>
           <w:bCs/>
         </w:rPr>
-        <w:t>FE80:</w:t>
+        <w:t>FE</w:t>
       </w:r>
       <w:proofErr w:type="gramStart"/>
       <w:r>
@@ -4809,7 +4767,7 @@
           <w:b/>
           <w:bCs/>
         </w:rPr>
-        <w:t>:VLAN</w:t>
+        <w:t>80::</w:t>
       </w:r>
       <w:proofErr w:type="gramEnd"/>
       <w:r>
@@ -4817,7 +4775,7 @@
           <w:b/>
           <w:bCs/>
         </w:rPr>
-        <w:t>-ID</w:t>
+        <w:t>VLAN-ID</w:t>
       </w:r>
       <w:r>
         <w:t xml:space="preserve">. </w:t>
@@ -5091,8 +5049,8 @@
     </w:p>
     <w:p>
       <w:r>
-        <w:pict>
-          <v:rect id="_x0000_i1034" style="width:468pt;height:1.5pt" o:hralign="center" o:hrstd="t" o:hrnoshade="t" o:hr="t" fillcolor="#974706 [1609]" stroked="f"/>
+        <w:pict w14:anchorId="06E7845B">
+          <v:rect id="_x0000_i1035" style="width:468pt;height:1.5pt" o:hralign="center" o:hrstd="t" o:hrnoshade="t" o:hr="t" fillcolor="#974706 [1609]" stroked="f"/>
         </w:pict>
       </w:r>
     </w:p>
@@ -5232,8 +5190,8 @@
     </w:p>
     <w:p>
       <w:r>
-        <w:pict>
-          <v:rect id="_x0000_i1035" style="width:468pt;height:1.5pt" o:hralign="center" o:hrstd="t" o:hrnoshade="t" o:hr="t" fillcolor="#974706 [1609]" stroked="f"/>
+        <w:pict w14:anchorId="7ACD56F8">
+          <v:rect id="_x0000_i1036" style="width:468pt;height:1.5pt" o:hralign="center" o:hrstd="t" o:hrnoshade="t" o:hr="t" fillcolor="#974706 [1609]" stroked="f"/>
         </w:pict>
       </w:r>
     </w:p>
@@ -5378,8 +5336,8 @@
     </w:p>
     <w:p>
       <w:r>
-        <w:pict>
-          <v:rect id="_x0000_i1036" style="width:468pt;height:1.5pt" o:hralign="center" o:hrstd="t" o:hrnoshade="t" o:hr="t" fillcolor="#974706 [1609]" stroked="f"/>
+        <w:pict w14:anchorId="328E65F9">
+          <v:rect id="_x0000_i1037" style="width:468pt;height:1.5pt" o:hralign="center" o:hrstd="t" o:hrnoshade="t" o:hr="t" fillcolor="#974706 [1609]" stroked="f"/>
         </w:pict>
       </w:r>
     </w:p>
@@ -5638,8 +5596,8 @@
     <w:p/>
     <w:p>
       <w:r>
-        <w:pict>
-          <v:rect id="_x0000_i1037" style="width:468pt;height:1.5pt" o:hralign="center" o:hrstd="t" o:hrnoshade="t" o:hr="t" fillcolor="#974706 [1609]" stroked="f"/>
+        <w:pict w14:anchorId="1BEAE14B">
+          <v:rect id="_x0000_i1038" style="width:468pt;height:1.5pt" o:hralign="center" o:hrstd="t" o:hrnoshade="t" o:hr="t" fillcolor="#974706 [1609]" stroked="f"/>
         </w:pict>
       </w:r>
     </w:p>
@@ -5717,8 +5675,8 @@
     </w:p>
     <w:p>
       <w:r>
-        <w:pict>
-          <v:rect id="_x0000_i1038" style="width:468pt;height:1.5pt" o:hralign="center" o:hrstd="t" o:hrnoshade="t" o:hr="t" fillcolor="#4e6128 [1606]" stroked="f"/>
+        <w:pict w14:anchorId="1CD1B9F0">
+          <v:rect id="_x0000_i1039" style="width:468pt;height:1.5pt" o:hralign="center" o:hrstd="t" o:hrnoshade="t" o:hr="t" fillcolor="#4e6128 [1606]" stroked="f"/>
         </w:pict>
       </w:r>
     </w:p>
@@ -5783,14 +5741,7 @@
       </w:r>
       <w:r>
         <w:br/>
-      </w:r>
-      <w:proofErr w:type="gramStart"/>
-      <w:r>
-        <w:t>Some</w:t>
-      </w:r>
-      <w:proofErr w:type="gramEnd"/>
-      <w:r>
-        <w:t xml:space="preserve"> device sections include tables labeled </w:t>
+        <w:t xml:space="preserve">Some device sections include tables labeled </w:t>
       </w:r>
       <w:r>
         <w:rPr>
@@ -9221,8 +9172,8 @@
     </w:tbl>
     <w:p>
       <w:r>
-        <w:pict>
-          <v:rect id="_x0000_i1039" style="width:468pt;height:1.5pt" o:hralign="center" o:hrstd="t" o:hrnoshade="t" o:hr="t" fillcolor="#974706 [1609]" stroked="f"/>
+        <w:pict w14:anchorId="34D6EECD">
+          <v:rect id="_x0000_i1040" style="width:468pt;height:1.5pt" o:hralign="center" o:hrstd="t" o:hrnoshade="t" o:hr="t" fillcolor="#974706 [1609]" stroked="f"/>
         </w:pict>
       </w:r>
     </w:p>
@@ -9329,14 +9280,12 @@
       <w:r>
         <w:t xml:space="preserve"> – </w:t>
       </w:r>
-      <w:bookmarkStart w:id="0" w:name="_GoBack"/>
       <w:r>
         <w:rPr>
           <w:b/>
         </w:rPr>
         <w:t>VLAN1</w:t>
       </w:r>
-      <w:bookmarkEnd w:id="0"/>
     </w:p>
     <w:p>
       <w:pPr>
@@ -11067,8 +11016,8 @@
     <w:p/>
     <w:p>
       <w:r>
-        <w:pict>
-          <v:rect id="_x0000_i1040" style="width:468pt;height:1.5pt" o:hralign="center" o:hrstd="t" o:hrnoshade="t" o:hr="t" fillcolor="#974706 [1609]" stroked="f"/>
+        <w:pict w14:anchorId="3493F44F">
+          <v:rect id="_x0000_i1041" style="width:468pt;height:1.5pt" o:hralign="center" o:hrstd="t" o:hrnoshade="t" o:hr="t" fillcolor="#974706 [1609]" stroked="f"/>
         </w:pict>
       </w:r>
     </w:p>
@@ -12230,8 +12179,8 @@
         </w:rPr>
       </w:pPr>
       <w:r>
-        <w:pict>
-          <v:rect id="_x0000_i1041" style="width:468pt;height:1.5pt" o:hralign="center" o:hrstd="t" o:hrnoshade="t" o:hr="t" fillcolor="#4e6128 [1606]" stroked="f"/>
+        <w:pict w14:anchorId="2B103944">
+          <v:rect id="_x0000_i1042" style="width:468pt;height:1.5pt" o:hralign="center" o:hrstd="t" o:hrnoshade="t" o:hr="t" fillcolor="#4e6128 [1606]" stroked="f"/>
         </w:pict>
       </w:r>
     </w:p>
@@ -12271,8 +12220,8 @@
         <w:rPr>
           <w:color w:val="4F6228" w:themeColor="accent3" w:themeShade="80"/>
         </w:rPr>
-        <w:pict>
-          <v:rect id="_x0000_i1042" style="width:468pt;height:2pt" o:hralign="center" o:hrstd="t" o:hrnoshade="t" o:hr="t" fillcolor="#484329 [814]" stroked="f"/>
+        <w:pict w14:anchorId="2871B2E2">
+          <v:rect id="_x0000_i1043" style="width:468pt;height:2pt" o:hralign="center" o:hrstd="t" o:hrnoshade="t" o:hr="t" fillcolor="#484329 [814]" stroked="f"/>
         </w:pict>
       </w:r>
     </w:p>
@@ -12308,8 +12257,8 @@
         </w:rPr>
       </w:pPr>
       <w:r>
-        <w:pict>
-          <v:rect id="_x0000_i1043" style="width:468pt;height:1.5pt" o:hralign="center" o:hrstd="t" o:hrnoshade="t" o:hr="t" fillcolor="#974706 [1609]" stroked="f"/>
+        <w:pict w14:anchorId="2CE83F07">
+          <v:rect id="_x0000_i1044" style="width:468pt;height:1.5pt" o:hralign="center" o:hrstd="t" o:hrnoshade="t" o:hr="t" fillcolor="#974706 [1609]" stroked="f"/>
         </w:pict>
       </w:r>
     </w:p>
@@ -13650,8 +13599,8 @@
           <w:sz w:val="30"/>
           <w:szCs w:val="30"/>
         </w:rPr>
-        <w:pict>
-          <v:rect id="_x0000_i1044" style="width:468pt;height:1.5pt" o:hralign="center" o:hrstd="t" o:hrnoshade="t" o:hr="t" fillcolor="#974706 [1609]" stroked="f"/>
+        <w:pict w14:anchorId="64C6A87D">
+          <v:rect id="_x0000_i1045" style="width:468pt;height:1.5pt" o:hralign="center" o:hrstd="t" o:hrnoshade="t" o:hr="t" fillcolor="#974706 [1609]" stroked="f"/>
         </w:pict>
       </w:r>
     </w:p>
@@ -15557,8 +15506,8 @@
           <w:sz w:val="30"/>
           <w:szCs w:val="30"/>
         </w:rPr>
-        <w:pict>
-          <v:rect id="_x0000_i1045" style="width:468pt;height:1.5pt" o:hralign="center" o:hrstd="t" o:hrnoshade="t" o:hr="t" fillcolor="#974706 [1609]" stroked="f"/>
+        <w:pict w14:anchorId="343A9F0C">
+          <v:rect id="_x0000_i1046" style="width:468pt;height:1.5pt" o:hralign="center" o:hrstd="t" o:hrnoshade="t" o:hr="t" fillcolor="#974706 [1609]" stroked="f"/>
         </w:pict>
       </w:r>
     </w:p>
@@ -15883,8 +15832,8 @@
           <w:sz w:val="36"/>
           <w:szCs w:val="36"/>
         </w:rPr>
-        <w:pict>
-          <v:rect id="_x0000_i1046" style="width:468pt;height:1.5pt" o:hralign="center" o:hrstd="t" o:hrnoshade="t" o:hr="t" fillcolor="#974706 [1609]" stroked="f"/>
+        <w:pict w14:anchorId="47F46ED1">
+          <v:rect id="_x0000_i1047" style="width:468pt;height:1.5pt" o:hralign="center" o:hrstd="t" o:hrnoshade="t" o:hr="t" fillcolor="#974706 [1609]" stroked="f"/>
         </w:pict>
       </w:r>
       <w:r>
@@ -15911,7 +15860,7 @@
 </file>
 
 <file path=word/endnotes.xml><?xml version="1.0" encoding="utf-8"?>
-<w:endnotes xmlns:wpc="http://schemas.microsoft.com/office/word/2010/wordprocessingCanvas" xmlns:mc="http://schemas.openxmlformats.org/markup-compatibility/2006" xmlns:o="urn:schemas-microsoft-com:office:office" xmlns:r="http://schemas.openxmlformats.org/officeDocument/2006/relationships" xmlns:m="http://schemas.openxmlformats.org/officeDocument/2006/math" xmlns:v="urn:schemas-microsoft-com:vml" xmlns:wp14="http://schemas.microsoft.com/office/word/2010/wordprocessingDrawing" xmlns:wp="http://schemas.openxmlformats.org/drawingml/2006/wordprocessingDrawing" xmlns:w10="urn:schemas-microsoft-com:office:word" xmlns:w="http://schemas.openxmlformats.org/wordprocessingml/2006/main" xmlns:w14="http://schemas.microsoft.com/office/word/2010/wordml" xmlns:w15="http://schemas.microsoft.com/office/word/2012/wordml" xmlns:wpg="http://schemas.microsoft.com/office/word/2010/wordprocessingGroup" xmlns:wpi="http://schemas.microsoft.com/office/word/2010/wordprocessingInk" xmlns:wne="http://schemas.microsoft.com/office/word/2006/wordml" xmlns:wps="http://schemas.microsoft.com/office/word/2010/wordprocessingShape" mc:Ignorable="w14 w15 wp14">
+<w:endnotes xmlns:wpc="http://schemas.microsoft.com/office/word/2010/wordprocessingCanvas" xmlns:cx="http://schemas.microsoft.com/office/drawing/2014/chartex" xmlns:cx1="http://schemas.microsoft.com/office/drawing/2015/9/8/chartex" xmlns:cx2="http://schemas.microsoft.com/office/drawing/2015/10/21/chartex" xmlns:cx3="http://schemas.microsoft.com/office/drawing/2016/5/9/chartex" xmlns:cx4="http://schemas.microsoft.com/office/drawing/2016/5/10/chartex" xmlns:cx5="http://schemas.microsoft.com/office/drawing/2016/5/11/chartex" xmlns:cx6="http://schemas.microsoft.com/office/drawing/2016/5/12/chartex" xmlns:cx7="http://schemas.microsoft.com/office/drawing/2016/5/13/chartex" xmlns:cx8="http://schemas.microsoft.com/office/drawing/2016/5/14/chartex" xmlns:mc="http://schemas.openxmlformats.org/markup-compatibility/2006" xmlns:aink="http://schemas.microsoft.com/office/drawing/2016/ink" xmlns:am3d="http://schemas.microsoft.com/office/drawing/2017/model3d" xmlns:o="urn:schemas-microsoft-com:office:office" xmlns:oel="http://schemas.microsoft.com/office/2019/extlst" xmlns:r="http://schemas.openxmlformats.org/officeDocument/2006/relationships" xmlns:m="http://schemas.openxmlformats.org/officeDocument/2006/math" xmlns:v="urn:schemas-microsoft-com:vml" xmlns:wp14="http://schemas.microsoft.com/office/word/2010/wordprocessingDrawing" xmlns:wp="http://schemas.openxmlformats.org/drawingml/2006/wordprocessingDrawing" xmlns:w10="urn:schemas-microsoft-com:office:word" xmlns:w="http://schemas.openxmlformats.org/wordprocessingml/2006/main" xmlns:w14="http://schemas.microsoft.com/office/word/2010/wordml" xmlns:w15="http://schemas.microsoft.com/office/word/2012/wordml" xmlns:w16cex="http://schemas.microsoft.com/office/word/2018/wordml/cex" xmlns:w16cid="http://schemas.microsoft.com/office/word/2016/wordml/cid" xmlns:w16="http://schemas.microsoft.com/office/word/2018/wordml" xmlns:w16sdtdh="http://schemas.microsoft.com/office/word/2020/wordml/sdtdatahash" xmlns:w16se="http://schemas.microsoft.com/office/word/2015/wordml/symex" xmlns:wpg="http://schemas.microsoft.com/office/word/2010/wordprocessingGroup" xmlns:wpi="http://schemas.microsoft.com/office/word/2010/wordprocessingInk" xmlns:wne="http://schemas.microsoft.com/office/word/2006/wordml" xmlns:wps="http://schemas.microsoft.com/office/word/2010/wordprocessingShape" mc:Ignorable="w14 w15 w16se w16cid w16 w16cex w16sdtdh wp14">
   <w:endnote w:type="separator" w:id="-1">
     <w:p>
       <w:r>
@@ -15930,7 +15879,7 @@
 </file>
 
 <file path=word/footer1.xml><?xml version="1.0" encoding="utf-8"?>
-<w:ftr xmlns:wpc="http://schemas.microsoft.com/office/word/2010/wordprocessingCanvas" xmlns:mc="http://schemas.openxmlformats.org/markup-compatibility/2006" xmlns:o="urn:schemas-microsoft-com:office:office" xmlns:r="http://schemas.openxmlformats.org/officeDocument/2006/relationships" xmlns:m="http://schemas.openxmlformats.org/officeDocument/2006/math" xmlns:v="urn:schemas-microsoft-com:vml" xmlns:wp14="http://schemas.microsoft.com/office/word/2010/wordprocessingDrawing" xmlns:wp="http://schemas.openxmlformats.org/drawingml/2006/wordprocessingDrawing" xmlns:w10="urn:schemas-microsoft-com:office:word" xmlns:w="http://schemas.openxmlformats.org/wordprocessingml/2006/main" xmlns:w14="http://schemas.microsoft.com/office/word/2010/wordml" xmlns:w15="http://schemas.microsoft.com/office/word/2012/wordml" xmlns:wpg="http://schemas.microsoft.com/office/word/2010/wordprocessingGroup" xmlns:wpi="http://schemas.microsoft.com/office/word/2010/wordprocessingInk" xmlns:wne="http://schemas.microsoft.com/office/word/2006/wordml" xmlns:wps="http://schemas.microsoft.com/office/word/2010/wordprocessingShape" mc:Ignorable="w14 w15 wp14">
+<w:ftr xmlns:wpc="http://schemas.microsoft.com/office/word/2010/wordprocessingCanvas" xmlns:cx="http://schemas.microsoft.com/office/drawing/2014/chartex" xmlns:cx1="http://schemas.microsoft.com/office/drawing/2015/9/8/chartex" xmlns:cx2="http://schemas.microsoft.com/office/drawing/2015/10/21/chartex" xmlns:cx3="http://schemas.microsoft.com/office/drawing/2016/5/9/chartex" xmlns:cx4="http://schemas.microsoft.com/office/drawing/2016/5/10/chartex" xmlns:cx5="http://schemas.microsoft.com/office/drawing/2016/5/11/chartex" xmlns:cx6="http://schemas.microsoft.com/office/drawing/2016/5/12/chartex" xmlns:cx7="http://schemas.microsoft.com/office/drawing/2016/5/13/chartex" xmlns:cx8="http://schemas.microsoft.com/office/drawing/2016/5/14/chartex" xmlns:mc="http://schemas.openxmlformats.org/markup-compatibility/2006" xmlns:aink="http://schemas.microsoft.com/office/drawing/2016/ink" xmlns:am3d="http://schemas.microsoft.com/office/drawing/2017/model3d" xmlns:o="urn:schemas-microsoft-com:office:office" xmlns:oel="http://schemas.microsoft.com/office/2019/extlst" xmlns:r="http://schemas.openxmlformats.org/officeDocument/2006/relationships" xmlns:m="http://schemas.openxmlformats.org/officeDocument/2006/math" xmlns:v="urn:schemas-microsoft-com:vml" xmlns:wp14="http://schemas.microsoft.com/office/word/2010/wordprocessingDrawing" xmlns:wp="http://schemas.openxmlformats.org/drawingml/2006/wordprocessingDrawing" xmlns:w10="urn:schemas-microsoft-com:office:word" xmlns:w="http://schemas.openxmlformats.org/wordprocessingml/2006/main" xmlns:w14="http://schemas.microsoft.com/office/word/2010/wordml" xmlns:w15="http://schemas.microsoft.com/office/word/2012/wordml" xmlns:w16cex="http://schemas.microsoft.com/office/word/2018/wordml/cex" xmlns:w16cid="http://schemas.microsoft.com/office/word/2016/wordml/cid" xmlns:w16="http://schemas.microsoft.com/office/word/2018/wordml" xmlns:w16sdtdh="http://schemas.microsoft.com/office/word/2020/wordml/sdtdatahash" xmlns:w16se="http://schemas.microsoft.com/office/word/2015/wordml/symex" xmlns:wpg="http://schemas.microsoft.com/office/word/2010/wordprocessingGroup" xmlns:wpi="http://schemas.microsoft.com/office/word/2010/wordprocessingInk" xmlns:wne="http://schemas.microsoft.com/office/word/2006/wordml" xmlns:wps="http://schemas.microsoft.com/office/word/2010/wordprocessingShape" mc:Ignorable="w14 w15 w16se w16cid w16 w16cex w16sdtdh wp14">
   <w:p>
     <w:pPr>
       <w:pStyle w:val="Footer"/>
@@ -15939,8 +15888,8 @@
       <w:rPr>
         <w:color w:val="4F6228" w:themeColor="accent3" w:themeShade="80"/>
       </w:rPr>
-      <w:pict>
-        <v:rect id="_x0000_i1047" style="width:468pt;height:2pt" o:hralign="center" o:hrstd="t" o:hrnoshade="t" o:hr="t" fillcolor="#c2d69b [1942]" stroked="f"/>
+      <w:pict w14:anchorId="39823DE9">
+        <v:rect id="_x0000_i1030" style="width:468pt;height:2pt" o:hralign="center" o:hrstd="t" o:hrnoshade="t" o:hr="t" fillcolor="#c2d69b [1942]" stroked="f"/>
       </w:pict>
     </w:r>
   </w:p>
@@ -15948,7 +15897,7 @@
 </file>
 
 <file path=word/footnotes.xml><?xml version="1.0" encoding="utf-8"?>
-<w:footnotes xmlns:wpc="http://schemas.microsoft.com/office/word/2010/wordprocessingCanvas" xmlns:mc="http://schemas.openxmlformats.org/markup-compatibility/2006" xmlns:o="urn:schemas-microsoft-com:office:office" xmlns:r="http://schemas.openxmlformats.org/officeDocument/2006/relationships" xmlns:m="http://schemas.openxmlformats.org/officeDocument/2006/math" xmlns:v="urn:schemas-microsoft-com:vml" xmlns:wp14="http://schemas.microsoft.com/office/word/2010/wordprocessingDrawing" xmlns:wp="http://schemas.openxmlformats.org/drawingml/2006/wordprocessingDrawing" xmlns:w10="urn:schemas-microsoft-com:office:word" xmlns:w="http://schemas.openxmlformats.org/wordprocessingml/2006/main" xmlns:w14="http://schemas.microsoft.com/office/word/2010/wordml" xmlns:w15="http://schemas.microsoft.com/office/word/2012/wordml" xmlns:wpg="http://schemas.microsoft.com/office/word/2010/wordprocessingGroup" xmlns:wpi="http://schemas.microsoft.com/office/word/2010/wordprocessingInk" xmlns:wne="http://schemas.microsoft.com/office/word/2006/wordml" xmlns:wps="http://schemas.microsoft.com/office/word/2010/wordprocessingShape" mc:Ignorable="w14 w15 wp14">
+<w:footnotes xmlns:wpc="http://schemas.microsoft.com/office/word/2010/wordprocessingCanvas" xmlns:cx="http://schemas.microsoft.com/office/drawing/2014/chartex" xmlns:cx1="http://schemas.microsoft.com/office/drawing/2015/9/8/chartex" xmlns:cx2="http://schemas.microsoft.com/office/drawing/2015/10/21/chartex" xmlns:cx3="http://schemas.microsoft.com/office/drawing/2016/5/9/chartex" xmlns:cx4="http://schemas.microsoft.com/office/drawing/2016/5/10/chartex" xmlns:cx5="http://schemas.microsoft.com/office/drawing/2016/5/11/chartex" xmlns:cx6="http://schemas.microsoft.com/office/drawing/2016/5/12/chartex" xmlns:cx7="http://schemas.microsoft.com/office/drawing/2016/5/13/chartex" xmlns:cx8="http://schemas.microsoft.com/office/drawing/2016/5/14/chartex" xmlns:mc="http://schemas.openxmlformats.org/markup-compatibility/2006" xmlns:aink="http://schemas.microsoft.com/office/drawing/2016/ink" xmlns:am3d="http://schemas.microsoft.com/office/drawing/2017/model3d" xmlns:o="urn:schemas-microsoft-com:office:office" xmlns:oel="http://schemas.microsoft.com/office/2019/extlst" xmlns:r="http://schemas.openxmlformats.org/officeDocument/2006/relationships" xmlns:m="http://schemas.openxmlformats.org/officeDocument/2006/math" xmlns:v="urn:schemas-microsoft-com:vml" xmlns:wp14="http://schemas.microsoft.com/office/word/2010/wordprocessingDrawing" xmlns:wp="http://schemas.openxmlformats.org/drawingml/2006/wordprocessingDrawing" xmlns:w10="urn:schemas-microsoft-com:office:word" xmlns:w="http://schemas.openxmlformats.org/wordprocessingml/2006/main" xmlns:w14="http://schemas.microsoft.com/office/word/2010/wordml" xmlns:w15="http://schemas.microsoft.com/office/word/2012/wordml" xmlns:w16cex="http://schemas.microsoft.com/office/word/2018/wordml/cex" xmlns:w16cid="http://schemas.microsoft.com/office/word/2016/wordml/cid" xmlns:w16="http://schemas.microsoft.com/office/word/2018/wordml" xmlns:w16sdtdh="http://schemas.microsoft.com/office/word/2020/wordml/sdtdatahash" xmlns:w16se="http://schemas.microsoft.com/office/word/2015/wordml/symex" xmlns:wpg="http://schemas.microsoft.com/office/word/2010/wordprocessingGroup" xmlns:wpi="http://schemas.microsoft.com/office/word/2010/wordprocessingInk" xmlns:wne="http://schemas.microsoft.com/office/word/2006/wordml" xmlns:wps="http://schemas.microsoft.com/office/word/2010/wordprocessingShape" mc:Ignorable="w14 w15 w16se w16cid w16 w16cex w16sdtdh wp14">
   <w:footnote w:type="separator" w:id="-1">
     <w:p>
       <w:r>
@@ -15967,7 +15916,7 @@
 </file>
 
 <file path=word/header1.xml><?xml version="1.0" encoding="utf-8"?>
-<w:hdr xmlns:wpc="http://schemas.microsoft.com/office/word/2010/wordprocessingCanvas" xmlns:mc="http://schemas.openxmlformats.org/markup-compatibility/2006" xmlns:o="urn:schemas-microsoft-com:office:office" xmlns:r="http://schemas.openxmlformats.org/officeDocument/2006/relationships" xmlns:m="http://schemas.openxmlformats.org/officeDocument/2006/math" xmlns:v="urn:schemas-microsoft-com:vml" xmlns:wp14="http://schemas.microsoft.com/office/word/2010/wordprocessingDrawing" xmlns:wp="http://schemas.openxmlformats.org/drawingml/2006/wordprocessingDrawing" xmlns:w10="urn:schemas-microsoft-com:office:word" xmlns:w="http://schemas.openxmlformats.org/wordprocessingml/2006/main" xmlns:w14="http://schemas.microsoft.com/office/word/2010/wordml" xmlns:w15="http://schemas.microsoft.com/office/word/2012/wordml" xmlns:wpg="http://schemas.microsoft.com/office/word/2010/wordprocessingGroup" xmlns:wpi="http://schemas.microsoft.com/office/word/2010/wordprocessingInk" xmlns:wne="http://schemas.microsoft.com/office/word/2006/wordml" xmlns:wps="http://schemas.microsoft.com/office/word/2010/wordprocessingShape" mc:Ignorable="w14 w15 wp14">
+<w:hdr xmlns:wpc="http://schemas.microsoft.com/office/word/2010/wordprocessingCanvas" xmlns:cx="http://schemas.microsoft.com/office/drawing/2014/chartex" xmlns:cx1="http://schemas.microsoft.com/office/drawing/2015/9/8/chartex" xmlns:cx2="http://schemas.microsoft.com/office/drawing/2015/10/21/chartex" xmlns:cx3="http://schemas.microsoft.com/office/drawing/2016/5/9/chartex" xmlns:cx4="http://schemas.microsoft.com/office/drawing/2016/5/10/chartex" xmlns:cx5="http://schemas.microsoft.com/office/drawing/2016/5/11/chartex" xmlns:cx6="http://schemas.microsoft.com/office/drawing/2016/5/12/chartex" xmlns:cx7="http://schemas.microsoft.com/office/drawing/2016/5/13/chartex" xmlns:cx8="http://schemas.microsoft.com/office/drawing/2016/5/14/chartex" xmlns:mc="http://schemas.openxmlformats.org/markup-compatibility/2006" xmlns:aink="http://schemas.microsoft.com/office/drawing/2016/ink" xmlns:am3d="http://schemas.microsoft.com/office/drawing/2017/model3d" xmlns:o="urn:schemas-microsoft-com:office:office" xmlns:oel="http://schemas.microsoft.com/office/2019/extlst" xmlns:r="http://schemas.openxmlformats.org/officeDocument/2006/relationships" xmlns:m="http://schemas.openxmlformats.org/officeDocument/2006/math" xmlns:v="urn:schemas-microsoft-com:vml" xmlns:wp14="http://schemas.microsoft.com/office/word/2010/wordprocessingDrawing" xmlns:wp="http://schemas.openxmlformats.org/drawingml/2006/wordprocessingDrawing" xmlns:w10="urn:schemas-microsoft-com:office:word" xmlns:w="http://schemas.openxmlformats.org/wordprocessingml/2006/main" xmlns:w14="http://schemas.microsoft.com/office/word/2010/wordml" xmlns:w15="http://schemas.microsoft.com/office/word/2012/wordml" xmlns:w16cex="http://schemas.microsoft.com/office/word/2018/wordml/cex" xmlns:w16cid="http://schemas.microsoft.com/office/word/2016/wordml/cid" xmlns:w16="http://schemas.microsoft.com/office/word/2018/wordml" xmlns:w16sdtdh="http://schemas.microsoft.com/office/word/2020/wordml/sdtdatahash" xmlns:w16se="http://schemas.microsoft.com/office/word/2015/wordml/symex" xmlns:wpg="http://schemas.microsoft.com/office/word/2010/wordprocessingGroup" xmlns:wpi="http://schemas.microsoft.com/office/word/2010/wordprocessingInk" xmlns:wne="http://schemas.microsoft.com/office/word/2006/wordml" xmlns:wps="http://schemas.microsoft.com/office/word/2010/wordprocessingShape" mc:Ignorable="w14 w15 w16se w16cid w16 w16cex w16sdtdh wp14">
   <w:p>
     <w:pPr>
       <w:pStyle w:val="Header"/>
@@ -15978,7 +15927,7 @@
         <w:noProof/>
       </w:rPr>
       <w:drawing>
-        <wp:inline distT="0" distB="0" distL="0" distR="0">
+        <wp:inline distT="0" distB="0" distL="0" distR="0" wp14:anchorId="7FE171BB" wp14:editId="06D521E7">
           <wp:extent cx="5709920" cy="1414145"/>
           <wp:effectExtent l="0" t="0" r="5080" b="0"/>
           <wp:docPr id="7" name="Picture 7" descr="Sonoran Outdoor Equipment logo featuring a hiking desert tortoise with Arizona mountains and a saguaro cactus." title="Document Header"/>
@@ -16033,7 +15982,7 @@
 </file>
 
 <file path=word/numbering.xml><?xml version="1.0" encoding="utf-8"?>
-<w:numbering xmlns:wpc="http://schemas.microsoft.com/office/word/2010/wordprocessingCanvas" xmlns:mc="http://schemas.openxmlformats.org/markup-compatibility/2006" xmlns:o="urn:schemas-microsoft-com:office:office" xmlns:r="http://schemas.openxmlformats.org/officeDocument/2006/relationships" xmlns:m="http://schemas.openxmlformats.org/officeDocument/2006/math" xmlns:v="urn:schemas-microsoft-com:vml" xmlns:wp14="http://schemas.microsoft.com/office/word/2010/wordprocessingDrawing" xmlns:wp="http://schemas.openxmlformats.org/drawingml/2006/wordprocessingDrawing" xmlns:w10="urn:schemas-microsoft-com:office:word" xmlns:w="http://schemas.openxmlformats.org/wordprocessingml/2006/main" xmlns:w14="http://schemas.microsoft.com/office/word/2010/wordml" xmlns:w15="http://schemas.microsoft.com/office/word/2012/wordml" xmlns:wpg="http://schemas.microsoft.com/office/word/2010/wordprocessingGroup" xmlns:wpi="http://schemas.microsoft.com/office/word/2010/wordprocessingInk" xmlns:wne="http://schemas.microsoft.com/office/word/2006/wordml" xmlns:wps="http://schemas.microsoft.com/office/word/2010/wordprocessingShape" mc:Ignorable="w14 w15 wp14">
+<w:numbering xmlns:wpc="http://schemas.microsoft.com/office/word/2010/wordprocessingCanvas" xmlns:cx="http://schemas.microsoft.com/office/drawing/2014/chartex" xmlns:cx1="http://schemas.microsoft.com/office/drawing/2015/9/8/chartex" xmlns:cx2="http://schemas.microsoft.com/office/drawing/2015/10/21/chartex" xmlns:cx3="http://schemas.microsoft.com/office/drawing/2016/5/9/chartex" xmlns:cx4="http://schemas.microsoft.com/office/drawing/2016/5/10/chartex" xmlns:cx5="http://schemas.microsoft.com/office/drawing/2016/5/11/chartex" xmlns:cx6="http://schemas.microsoft.com/office/drawing/2016/5/12/chartex" xmlns:cx7="http://schemas.microsoft.com/office/drawing/2016/5/13/chartex" xmlns:cx8="http://schemas.microsoft.com/office/drawing/2016/5/14/chartex" xmlns:mc="http://schemas.openxmlformats.org/markup-compatibility/2006" xmlns:aink="http://schemas.microsoft.com/office/drawing/2016/ink" xmlns:am3d="http://schemas.microsoft.com/office/drawing/2017/model3d" xmlns:o="urn:schemas-microsoft-com:office:office" xmlns:oel="http://schemas.microsoft.com/office/2019/extlst" xmlns:r="http://schemas.openxmlformats.org/officeDocument/2006/relationships" xmlns:m="http://schemas.openxmlformats.org/officeDocument/2006/math" xmlns:v="urn:schemas-microsoft-com:vml" xmlns:wp14="http://schemas.microsoft.com/office/word/2010/wordprocessingDrawing" xmlns:wp="http://schemas.openxmlformats.org/drawingml/2006/wordprocessingDrawing" xmlns:w10="urn:schemas-microsoft-com:office:word" xmlns:w="http://schemas.openxmlformats.org/wordprocessingml/2006/main" xmlns:w14="http://schemas.microsoft.com/office/word/2010/wordml" xmlns:w15="http://schemas.microsoft.com/office/word/2012/wordml" xmlns:w16cex="http://schemas.microsoft.com/office/word/2018/wordml/cex" xmlns:w16cid="http://schemas.microsoft.com/office/word/2016/wordml/cid" xmlns:w16="http://schemas.microsoft.com/office/word/2018/wordml" xmlns:w16sdtdh="http://schemas.microsoft.com/office/word/2020/wordml/sdtdatahash" xmlns:w16se="http://schemas.microsoft.com/office/word/2015/wordml/symex" xmlns:wpg="http://schemas.microsoft.com/office/word/2010/wordprocessingGroup" xmlns:wpi="http://schemas.microsoft.com/office/word/2010/wordprocessingInk" xmlns:wne="http://schemas.microsoft.com/office/word/2006/wordml" xmlns:wps="http://schemas.microsoft.com/office/word/2010/wordprocessingShape" mc:Ignorable="w14 w15 w16se w16cid w16 w16cex w16sdtdh wp14">
   <w:abstractNum w:abstractNumId="0" w15:restartNumberingAfterBreak="0">
     <w:nsid w:val="FFFFFF7C"/>
     <w:multiLevelType w:val="singleLevel"/>
@@ -21122,137 +21071,137 @@
       </w:rPr>
     </w:lvl>
   </w:abstractNum>
-  <w:num w:numId="1">
+  <w:num w:numId="1" w16cid:durableId="1840074618">
     <w:abstractNumId w:val="8"/>
   </w:num>
-  <w:num w:numId="2">
+  <w:num w:numId="2" w16cid:durableId="142745983">
     <w:abstractNumId w:val="6"/>
   </w:num>
-  <w:num w:numId="3">
+  <w:num w:numId="3" w16cid:durableId="1976107609">
     <w:abstractNumId w:val="5"/>
   </w:num>
-  <w:num w:numId="4">
+  <w:num w:numId="4" w16cid:durableId="847910341">
     <w:abstractNumId w:val="4"/>
   </w:num>
-  <w:num w:numId="5">
+  <w:num w:numId="5" w16cid:durableId="133108047">
     <w:abstractNumId w:val="7"/>
   </w:num>
-  <w:num w:numId="6">
+  <w:num w:numId="6" w16cid:durableId="575407244">
     <w:abstractNumId w:val="3"/>
   </w:num>
-  <w:num w:numId="7">
+  <w:num w:numId="7" w16cid:durableId="394857727">
     <w:abstractNumId w:val="2"/>
   </w:num>
-  <w:num w:numId="8">
+  <w:num w:numId="8" w16cid:durableId="247229267">
     <w:abstractNumId w:val="1"/>
   </w:num>
-  <w:num w:numId="9">
+  <w:num w:numId="9" w16cid:durableId="294069073">
     <w:abstractNumId w:val="0"/>
   </w:num>
-  <w:num w:numId="10">
+  <w:num w:numId="10" w16cid:durableId="1953589311">
     <w:abstractNumId w:val="9"/>
   </w:num>
-  <w:num w:numId="11">
+  <w:num w:numId="11" w16cid:durableId="1937639251">
     <w:abstractNumId w:val="22"/>
   </w:num>
-  <w:num w:numId="12">
+  <w:num w:numId="12" w16cid:durableId="938100264">
     <w:abstractNumId w:val="25"/>
   </w:num>
-  <w:num w:numId="13">
+  <w:num w:numId="13" w16cid:durableId="974683261">
     <w:abstractNumId w:val="41"/>
   </w:num>
-  <w:num w:numId="14">
+  <w:num w:numId="14" w16cid:durableId="101843962">
     <w:abstractNumId w:val="30"/>
   </w:num>
-  <w:num w:numId="15">
+  <w:num w:numId="15" w16cid:durableId="1472208606">
     <w:abstractNumId w:val="31"/>
   </w:num>
-  <w:num w:numId="16">
+  <w:num w:numId="16" w16cid:durableId="379405684">
     <w:abstractNumId w:val="10"/>
   </w:num>
-  <w:num w:numId="17">
+  <w:num w:numId="17" w16cid:durableId="782843717">
     <w:abstractNumId w:val="26"/>
   </w:num>
-  <w:num w:numId="18">
+  <w:num w:numId="18" w16cid:durableId="1619946742">
     <w:abstractNumId w:val="19"/>
   </w:num>
-  <w:num w:numId="19">
+  <w:num w:numId="19" w16cid:durableId="498083882">
     <w:abstractNumId w:val="20"/>
   </w:num>
-  <w:num w:numId="20">
+  <w:num w:numId="20" w16cid:durableId="347371729">
     <w:abstractNumId w:val="40"/>
   </w:num>
-  <w:num w:numId="21">
+  <w:num w:numId="21" w16cid:durableId="2129425614">
     <w:abstractNumId w:val="21"/>
   </w:num>
-  <w:num w:numId="22">
+  <w:num w:numId="22" w16cid:durableId="1235700847">
     <w:abstractNumId w:val="36"/>
   </w:num>
-  <w:num w:numId="23">
+  <w:num w:numId="23" w16cid:durableId="1951472243">
     <w:abstractNumId w:val="23"/>
   </w:num>
-  <w:num w:numId="24">
+  <w:num w:numId="24" w16cid:durableId="751512706">
     <w:abstractNumId w:val="34"/>
   </w:num>
-  <w:num w:numId="25">
+  <w:num w:numId="25" w16cid:durableId="897327125">
     <w:abstractNumId w:val="11"/>
   </w:num>
-  <w:num w:numId="26">
+  <w:num w:numId="26" w16cid:durableId="379282634">
     <w:abstractNumId w:val="14"/>
   </w:num>
-  <w:num w:numId="27">
+  <w:num w:numId="27" w16cid:durableId="1241985609">
     <w:abstractNumId w:val="15"/>
   </w:num>
-  <w:num w:numId="28">
+  <w:num w:numId="28" w16cid:durableId="317612476">
     <w:abstractNumId w:val="24"/>
   </w:num>
-  <w:num w:numId="29">
+  <w:num w:numId="29" w16cid:durableId="480392122">
     <w:abstractNumId w:val="37"/>
   </w:num>
-  <w:num w:numId="30">
+  <w:num w:numId="30" w16cid:durableId="1355962761">
     <w:abstractNumId w:val="13"/>
   </w:num>
-  <w:num w:numId="31">
+  <w:num w:numId="31" w16cid:durableId="1027412124">
     <w:abstractNumId w:val="38"/>
   </w:num>
-  <w:num w:numId="32">
+  <w:num w:numId="32" w16cid:durableId="588195384">
     <w:abstractNumId w:val="27"/>
   </w:num>
-  <w:num w:numId="33">
+  <w:num w:numId="33" w16cid:durableId="842206430">
     <w:abstractNumId w:val="18"/>
   </w:num>
-  <w:num w:numId="34">
+  <w:num w:numId="34" w16cid:durableId="207305362">
     <w:abstractNumId w:val="32"/>
   </w:num>
-  <w:num w:numId="35">
+  <w:num w:numId="35" w16cid:durableId="324551015">
     <w:abstractNumId w:val="12"/>
   </w:num>
-  <w:num w:numId="36">
+  <w:num w:numId="36" w16cid:durableId="328139961">
     <w:abstractNumId w:val="33"/>
   </w:num>
-  <w:num w:numId="37">
+  <w:num w:numId="37" w16cid:durableId="116065964">
     <w:abstractNumId w:val="29"/>
   </w:num>
-  <w:num w:numId="38">
+  <w:num w:numId="38" w16cid:durableId="709110976">
     <w:abstractNumId w:val="39"/>
   </w:num>
-  <w:num w:numId="39">
+  <w:num w:numId="39" w16cid:durableId="361247867">
     <w:abstractNumId w:val="28"/>
   </w:num>
-  <w:num w:numId="40">
+  <w:num w:numId="40" w16cid:durableId="1940946462">
     <w:abstractNumId w:val="17"/>
   </w:num>
-  <w:num w:numId="41">
+  <w:num w:numId="41" w16cid:durableId="1864316848">
     <w:abstractNumId w:val="35"/>
   </w:num>
-  <w:num w:numId="42">
+  <w:num w:numId="42" w16cid:durableId="2061512677">
     <w:abstractNumId w:val="16"/>
   </w:num>
 </w:numbering>
 </file>
 
 <file path=word/styles.xml><?xml version="1.0" encoding="utf-8"?>
-<w:styles xmlns:mc="http://schemas.openxmlformats.org/markup-compatibility/2006" xmlns:r="http://schemas.openxmlformats.org/officeDocument/2006/relationships" xmlns:w="http://schemas.openxmlformats.org/wordprocessingml/2006/main" xmlns:w14="http://schemas.microsoft.com/office/word/2010/wordml" xmlns:w15="http://schemas.microsoft.com/office/word/2012/wordml" mc:Ignorable="w14 w15">
+<w:styles xmlns:mc="http://schemas.openxmlformats.org/markup-compatibility/2006" xmlns:r="http://schemas.openxmlformats.org/officeDocument/2006/relationships" xmlns:w="http://schemas.openxmlformats.org/wordprocessingml/2006/main" xmlns:w14="http://schemas.microsoft.com/office/word/2010/wordml" xmlns:w15="http://schemas.microsoft.com/office/word/2012/wordml" xmlns:w16cex="http://schemas.microsoft.com/office/word/2018/wordml/cex" xmlns:w16cid="http://schemas.microsoft.com/office/word/2016/wordml/cid" xmlns:w16="http://schemas.microsoft.com/office/word/2018/wordml" xmlns:w16sdtdh="http://schemas.microsoft.com/office/word/2020/wordml/sdtdatahash" xmlns:w16se="http://schemas.microsoft.com/office/word/2015/wordml/symex" mc:Ignorable="w14 w15 w16se w16cid w16 w16cex w16sdtdh">
   <w:docDefaults>
     <w:rPrDefault>
       <w:rPr>
@@ -21268,7 +21217,7 @@
       </w:pPr>
     </w:pPrDefault>
   </w:docDefaults>
-  <w:latentStyles w:defLockedState="0" w:defUIPriority="99" w:defSemiHidden="0" w:defUnhideWhenUsed="0" w:defQFormat="0" w:count="371">
+  <w:latentStyles w:defLockedState="0" w:defUIPriority="99" w:defSemiHidden="0" w:defUnhideWhenUsed="0" w:defQFormat="0" w:count="376">
     <w:lsdException w:name="Normal" w:uiPriority="0" w:qFormat="1"/>
     <w:lsdException w:name="heading 1" w:uiPriority="9" w:qFormat="1"/>
     <w:lsdException w:name="heading 2" w:semiHidden="1" w:uiPriority="9" w:unhideWhenUsed="1" w:qFormat="1"/>
@@ -21631,6 +21580,11 @@
     <w:lsdException w:name="List Table 5 Dark Accent 6" w:uiPriority="50"/>
     <w:lsdException w:name="List Table 6 Colorful Accent 6" w:uiPriority="51"/>
     <w:lsdException w:name="List Table 7 Colorful Accent 6" w:uiPriority="52"/>
+    <w:lsdException w:name="Mention" w:semiHidden="1" w:unhideWhenUsed="1"/>
+    <w:lsdException w:name="Smart Hyperlink" w:semiHidden="1" w:unhideWhenUsed="1"/>
+    <w:lsdException w:name="Hashtag" w:semiHidden="1" w:unhideWhenUsed="1"/>
+    <w:lsdException w:name="Unresolved Mention" w:semiHidden="1" w:unhideWhenUsed="1"/>
+    <w:lsdException w:name="Smart Link" w:semiHidden="1" w:unhideWhenUsed="1"/>
   </w:latentStyles>
   <w:style w:type="paragraph" w:default="1" w:styleId="Normal">
     <w:name w:val="Normal"/>

</xml_diff>

<commit_message>
Uploaded corrected versin of SOE - Enterprise IP address plan
</commit_message>
<xml_diff>
--- a/downloads/SOE - Enterprise_IP_Address_Plan.docx
+++ b/downloads/SOE - Enterprise_IP_Address_Plan.docx
@@ -1345,6 +1345,14 @@
       <w:tblPr>
         <w:tblW w:w="5000" w:type="pct"/>
         <w:tblCellSpacing w:w="15" w:type="dxa"/>
+        <w:tblBorders>
+          <w:top w:val="single" w:sz="4" w:space="0" w:color="auto"/>
+          <w:left w:val="single" w:sz="4" w:space="0" w:color="auto"/>
+          <w:bottom w:val="single" w:sz="4" w:space="0" w:color="auto"/>
+          <w:right w:val="single" w:sz="4" w:space="0" w:color="auto"/>
+          <w:insideH w:val="single" w:sz="4" w:space="0" w:color="auto"/>
+          <w:insideV w:val="single" w:sz="4" w:space="0" w:color="auto"/>
+        </w:tblBorders>
         <w:tblCellMar>
           <w:top w:w="72" w:type="dxa"/>
           <w:left w:w="115" w:type="dxa"/>
@@ -1356,9 +1364,9 @@
         <w:tblDescription w:val="Table listing the network requirements for the Tucson Distribution Center, including each department, associated VLAN ID, and required number of host addresses used to develop the enterprise IPv4 addressing plan."/>
       </w:tblPr>
       <w:tblGrid>
-        <w:gridCol w:w="5628"/>
-        <w:gridCol w:w="1977"/>
-        <w:gridCol w:w="1755"/>
+        <w:gridCol w:w="5592"/>
+        <w:gridCol w:w="1989"/>
+        <w:gridCol w:w="1769"/>
       </w:tblGrid>
       <w:tr>
         <w:trPr>
@@ -1591,6 +1599,14 @@
       <w:tblPr>
         <w:tblW w:w="5000" w:type="pct"/>
         <w:tblCellSpacing w:w="15" w:type="dxa"/>
+        <w:tblBorders>
+          <w:top w:val="single" w:sz="4" w:space="0" w:color="auto"/>
+          <w:left w:val="single" w:sz="4" w:space="0" w:color="auto"/>
+          <w:bottom w:val="single" w:sz="4" w:space="0" w:color="auto"/>
+          <w:right w:val="single" w:sz="4" w:space="0" w:color="auto"/>
+          <w:insideH w:val="single" w:sz="4" w:space="0" w:color="auto"/>
+          <w:insideV w:val="single" w:sz="4" w:space="0" w:color="auto"/>
+        </w:tblBorders>
         <w:tblCellMar>
           <w:top w:w="72" w:type="dxa"/>
           <w:left w:w="115" w:type="dxa"/>
@@ -1602,9 +1618,9 @@
         <w:tblDescription w:val="Table listing the network requirements for the Flagstaff Sales Office, including each department, associated VLAN ID, and required number of host addresses used to develop the enterprise IPv4 addressing plan."/>
       </w:tblPr>
       <w:tblGrid>
-        <w:gridCol w:w="5628"/>
-        <w:gridCol w:w="1977"/>
-        <w:gridCol w:w="1755"/>
+        <w:gridCol w:w="5592"/>
+        <w:gridCol w:w="1989"/>
+        <w:gridCol w:w="1769"/>
       </w:tblGrid>
       <w:tr>
         <w:trPr>
@@ -1750,6 +1766,14 @@
       <w:tblPr>
         <w:tblW w:w="5000" w:type="pct"/>
         <w:tblCellSpacing w:w="15" w:type="dxa"/>
+        <w:tblBorders>
+          <w:top w:val="single" w:sz="4" w:space="0" w:color="auto"/>
+          <w:left w:val="single" w:sz="4" w:space="0" w:color="auto"/>
+          <w:bottom w:val="single" w:sz="4" w:space="0" w:color="auto"/>
+          <w:right w:val="single" w:sz="4" w:space="0" w:color="auto"/>
+          <w:insideH w:val="single" w:sz="4" w:space="0" w:color="auto"/>
+          <w:insideV w:val="single" w:sz="4" w:space="0" w:color="auto"/>
+        </w:tblBorders>
         <w:tblCellMar>
           <w:top w:w="72" w:type="dxa"/>
           <w:left w:w="115" w:type="dxa"/>
@@ -1761,8 +1785,8 @@
         <w:tblDescription w:val="Table listing the reserved future expansion sites, including Tubac Adventure Lodge and Greer Mountain Cabins, along with the required number of host addresses reserved for future enterprise growth."/>
       </w:tblPr>
       <w:tblGrid>
-        <w:gridCol w:w="6660"/>
-        <w:gridCol w:w="2700"/>
+        <w:gridCol w:w="6653"/>
+        <w:gridCol w:w="2697"/>
       </w:tblGrid>
       <w:tr>
         <w:trPr>
@@ -1902,6 +1926,14 @@
       <w:tblPr>
         <w:tblW w:w="5000" w:type="pct"/>
         <w:tblCellSpacing w:w="15" w:type="dxa"/>
+        <w:tblBorders>
+          <w:top w:val="single" w:sz="4" w:space="0" w:color="auto"/>
+          <w:left w:val="single" w:sz="4" w:space="0" w:color="auto"/>
+          <w:bottom w:val="single" w:sz="4" w:space="0" w:color="auto"/>
+          <w:right w:val="single" w:sz="4" w:space="0" w:color="auto"/>
+          <w:insideH w:val="single" w:sz="4" w:space="0" w:color="auto"/>
+          <w:insideV w:val="single" w:sz="4" w:space="0" w:color="auto"/>
+        </w:tblBorders>
         <w:tblCellMar>
           <w:top w:w="72" w:type="dxa"/>
           <w:left w:w="115" w:type="dxa"/>
@@ -1913,8 +1945,8 @@
         <w:tblDescription w:val="Table listing the enterprise WAN connections between headquarters, Tucson, and Flagstaff routers, including the required number of host addresses for each point-to-point WAN link."/>
       </w:tblPr>
       <w:tblGrid>
-        <w:gridCol w:w="6663"/>
-        <w:gridCol w:w="2697"/>
+        <w:gridCol w:w="6631"/>
+        <w:gridCol w:w="2719"/>
       </w:tblGrid>
       <w:tr>
         <w:trPr>
@@ -2087,6 +2119,14 @@
       <w:tblPr>
         <w:tblW w:w="5000" w:type="pct"/>
         <w:tblCellSpacing w:w="15" w:type="dxa"/>
+        <w:tblBorders>
+          <w:top w:val="single" w:sz="4" w:space="0" w:color="auto"/>
+          <w:left w:val="single" w:sz="4" w:space="0" w:color="auto"/>
+          <w:bottom w:val="single" w:sz="4" w:space="0" w:color="auto"/>
+          <w:right w:val="single" w:sz="4" w:space="0" w:color="auto"/>
+          <w:insideH w:val="single" w:sz="4" w:space="0" w:color="auto"/>
+          <w:insideV w:val="single" w:sz="4" w:space="0" w:color="auto"/>
+        </w:tblBorders>
         <w:tblCellMar>
           <w:top w:w="72" w:type="dxa"/>
           <w:left w:w="115" w:type="dxa"/>
@@ -2098,8 +2138,8 @@
         <w:tblDescription w:val="Table listing the enterprise WAN connections between headquarters, Tucson, and Flagstaff routers, including the required number of host addresses for each point-to-point WAN link."/>
       </w:tblPr>
       <w:tblGrid>
-        <w:gridCol w:w="6570"/>
-        <w:gridCol w:w="2790"/>
+        <w:gridCol w:w="6538"/>
+        <w:gridCol w:w="2812"/>
       </w:tblGrid>
       <w:tr>
         <w:trPr>
@@ -2373,7 +2413,6 @@
         <w:spacing w:before="0" w:beforeAutospacing="0" w:after="0" w:afterAutospacing="0"/>
       </w:pPr>
       <w:r>
-        <w:lastRenderedPageBreak/>
         <w:t xml:space="preserve">Enterprise Network </w:t>
       </w:r>
       <w:r>
@@ -2393,6 +2432,14 @@
       <w:tblPr>
         <w:tblW w:w="12870" w:type="dxa"/>
         <w:tblCellSpacing w:w="15" w:type="dxa"/>
+        <w:tblBorders>
+          <w:top w:val="single" w:sz="4" w:space="0" w:color="auto"/>
+          <w:left w:val="single" w:sz="4" w:space="0" w:color="auto"/>
+          <w:bottom w:val="single" w:sz="4" w:space="0" w:color="auto"/>
+          <w:right w:val="single" w:sz="4" w:space="0" w:color="auto"/>
+          <w:insideH w:val="single" w:sz="4" w:space="0" w:color="auto"/>
+          <w:insideV w:val="single" w:sz="4" w:space="0" w:color="auto"/>
+        </w:tblBorders>
         <w:tblLayout w:type="fixed"/>
         <w:tblCellMar>
           <w:top w:w="29" w:type="dxa"/>
@@ -3477,7 +3524,6 @@
           <w:rFonts w:ascii="Segoe UI Symbol" w:hAnsi="Segoe UI Symbol" w:cs="Segoe UI Symbol"/>
           <w:color w:val="FF0000"/>
         </w:rPr>
-        <w:lastRenderedPageBreak/>
         <w:t>⚠</w:t>
       </w:r>
       <w:r>
@@ -3538,6 +3584,14 @@
       <w:tblPr>
         <w:tblW w:w="12870" w:type="dxa"/>
         <w:tblCellSpacing w:w="15" w:type="dxa"/>
+        <w:tblBorders>
+          <w:top w:val="single" w:sz="4" w:space="0" w:color="auto"/>
+          <w:left w:val="single" w:sz="4" w:space="0" w:color="auto"/>
+          <w:bottom w:val="single" w:sz="4" w:space="0" w:color="auto"/>
+          <w:right w:val="single" w:sz="4" w:space="0" w:color="auto"/>
+          <w:insideH w:val="single" w:sz="4" w:space="0" w:color="auto"/>
+          <w:insideV w:val="single" w:sz="4" w:space="0" w:color="auto"/>
+        </w:tblBorders>
         <w:tblLayout w:type="fixed"/>
         <w:tblCellMar>
           <w:top w:w="29" w:type="dxa"/>
@@ -3830,6 +3884,14 @@
       <w:tblPr>
         <w:tblW w:w="12870" w:type="dxa"/>
         <w:tblCellSpacing w:w="15" w:type="dxa"/>
+        <w:tblBorders>
+          <w:top w:val="single" w:sz="4" w:space="0" w:color="auto"/>
+          <w:left w:val="single" w:sz="4" w:space="0" w:color="auto"/>
+          <w:bottom w:val="single" w:sz="4" w:space="0" w:color="auto"/>
+          <w:right w:val="single" w:sz="4" w:space="0" w:color="auto"/>
+          <w:insideH w:val="single" w:sz="4" w:space="0" w:color="auto"/>
+          <w:insideV w:val="single" w:sz="4" w:space="0" w:color="auto"/>
+        </w:tblBorders>
         <w:tblLayout w:type="fixed"/>
         <w:tblCellMar>
           <w:top w:w="29" w:type="dxa"/>
@@ -4350,7 +4412,6 @@
         </w:rPr>
       </w:pPr>
       <w:r>
-        <w:lastRenderedPageBreak/>
         <w:pict w14:anchorId="57DF3F95">
           <v:rect id="_x0000_i1031" style="width:468pt;height:1.5pt" o:hralign="center" o:hrstd="t" o:hrnoshade="t" o:hr="t" fillcolor="#4e6128 [1606]" stroked="f"/>
         </w:pict>
@@ -4709,7 +4770,6 @@
         <w:spacing w:before="100" w:beforeAutospacing="1" w:after="100" w:afterAutospacing="1"/>
       </w:pPr>
       <w:r>
-        <w:lastRenderedPageBreak/>
         <w:t xml:space="preserve">Configure a manually assigned IPv6 link-local address on every active router interface and </w:t>
       </w:r>
       <w:proofErr w:type="spellStart"/>
@@ -5234,7 +5294,6 @@
         <w:spacing w:before="100" w:beforeAutospacing="1" w:after="100" w:afterAutospacing="1"/>
       </w:pPr>
       <w:r>
-        <w:lastRenderedPageBreak/>
         <w:t xml:space="preserve">First end device: Second usable address </w:t>
       </w:r>
     </w:p>
@@ -5382,6 +5441,14 @@
       <w:tblPr>
         <w:tblW w:w="0" w:type="auto"/>
         <w:tblCellSpacing w:w="15" w:type="dxa"/>
+        <w:tblBorders>
+          <w:top w:val="single" w:sz="4" w:space="0" w:color="auto"/>
+          <w:left w:val="single" w:sz="4" w:space="0" w:color="auto"/>
+          <w:bottom w:val="single" w:sz="4" w:space="0" w:color="auto"/>
+          <w:right w:val="single" w:sz="4" w:space="0" w:color="auto"/>
+          <w:insideH w:val="single" w:sz="4" w:space="0" w:color="auto"/>
+          <w:insideV w:val="single" w:sz="4" w:space="0" w:color="auto"/>
+        </w:tblBorders>
         <w:tblCellMar>
           <w:top w:w="72" w:type="dxa"/>
           <w:left w:w="115" w:type="dxa"/>
@@ -5393,10 +5460,10 @@
         <w:tblDescription w:val="Table listing the enterprise DNS server information. The table identifies the centralized DNS server (HQ-DNS1) located at Phoenix Headquarters and provides its assigned IPv4 address (10.10.40.9) and IPv6 address (2001:db8:acad:40::9). These addresses are used by enterprise DHCP and Stateless DHCPv6 services to distribute DNS configuration to client devices."/>
       </w:tblPr>
       <w:tblGrid>
-        <w:gridCol w:w="1710"/>
-        <w:gridCol w:w="2430"/>
-        <w:gridCol w:w="1980"/>
-        <w:gridCol w:w="3240"/>
+        <w:gridCol w:w="1708"/>
+        <w:gridCol w:w="2427"/>
+        <w:gridCol w:w="1978"/>
+        <w:gridCol w:w="3237"/>
       </w:tblGrid>
       <w:tr>
         <w:trPr>
@@ -5693,7 +5760,6 @@
         <w:spacing w:before="100" w:beforeAutospacing="1" w:after="100" w:afterAutospacing="1"/>
       </w:pPr>
       <w:r>
-        <w:lastRenderedPageBreak/>
         <w:t>Complete the tables below by assigning IPv4 and IPv6 addresses to the enterprise router interfaces, switch management interfaces, WAN interfaces, loopback interfaces, and end devices according to the Enterprise Interface Addressing Standards defined in this document.</w:t>
       </w:r>
     </w:p>
@@ -5866,6 +5932,14 @@
       <w:tblPr>
         <w:tblW w:w="0" w:type="auto"/>
         <w:tblCellSpacing w:w="15" w:type="dxa"/>
+        <w:tblBorders>
+          <w:top w:val="single" w:sz="4" w:space="0" w:color="auto"/>
+          <w:left w:val="single" w:sz="4" w:space="0" w:color="auto"/>
+          <w:bottom w:val="single" w:sz="4" w:space="0" w:color="auto"/>
+          <w:right w:val="single" w:sz="4" w:space="0" w:color="auto"/>
+          <w:insideH w:val="single" w:sz="4" w:space="0" w:color="auto"/>
+          <w:insideV w:val="single" w:sz="4" w:space="0" w:color="auto"/>
+        </w:tblBorders>
         <w:tblLayout w:type="fixed"/>
         <w:tblCellMar>
           <w:top w:w="43" w:type="dxa"/>
@@ -6529,7 +6603,6 @@
         <w:pStyle w:val="LabNote"/>
       </w:pPr>
       <w:r>
-        <w:lastRenderedPageBreak/>
         <w:t>The Enterprise Interface Addressing Plan documents both currently implemented interfaces and interfaces reserved for future enterprise expansion. Some interfaces documented in this plan will not be configured until directed by a future Enterprise Change Request (ECR).</w:t>
       </w:r>
     </w:p>
@@ -6591,7 +6664,6 @@
         <w:pStyle w:val="Heading3"/>
       </w:pPr>
       <w:r>
-        <w:lastRenderedPageBreak/>
         <w:t>Enterprise Interface Addressing Plan</w:t>
       </w:r>
     </w:p>
@@ -6625,6 +6697,14 @@
       <w:tblPr>
         <w:tblW w:w="13084" w:type="dxa"/>
         <w:tblCellSpacing w:w="15" w:type="dxa"/>
+        <w:tblBorders>
+          <w:top w:val="single" w:sz="4" w:space="0" w:color="auto"/>
+          <w:left w:val="single" w:sz="4" w:space="0" w:color="auto"/>
+          <w:bottom w:val="single" w:sz="4" w:space="0" w:color="auto"/>
+          <w:right w:val="single" w:sz="4" w:space="0" w:color="auto"/>
+          <w:insideH w:val="single" w:sz="4" w:space="0" w:color="auto"/>
+          <w:insideV w:val="single" w:sz="4" w:space="0" w:color="auto"/>
+        </w:tblBorders>
         <w:tblLayout w:type="fixed"/>
         <w:tblCellMar>
           <w:top w:w="43" w:type="dxa"/>
@@ -7517,7 +7597,6 @@
           <w:sz w:val="27"/>
           <w:szCs w:val="27"/>
         </w:rPr>
-        <w:lastRenderedPageBreak/>
         <w:t>HQ-R1 – Future Interface IP Addressing</w:t>
       </w:r>
     </w:p>
@@ -7546,6 +7625,14 @@
       <w:tblPr>
         <w:tblW w:w="13050" w:type="dxa"/>
         <w:tblCellSpacing w:w="15" w:type="dxa"/>
+        <w:tblBorders>
+          <w:top w:val="single" w:sz="4" w:space="0" w:color="auto"/>
+          <w:left w:val="single" w:sz="4" w:space="0" w:color="auto"/>
+          <w:bottom w:val="single" w:sz="4" w:space="0" w:color="auto"/>
+          <w:right w:val="single" w:sz="4" w:space="0" w:color="auto"/>
+          <w:insideH w:val="single" w:sz="4" w:space="0" w:color="auto"/>
+          <w:insideV w:val="single" w:sz="4" w:space="0" w:color="auto"/>
+        </w:tblBorders>
         <w:tblLayout w:type="fixed"/>
         <w:tblCellMar>
           <w:top w:w="43" w:type="dxa"/>
@@ -7944,6 +8031,14 @@
       <w:tblPr>
         <w:tblW w:w="14940" w:type="dxa"/>
         <w:tblCellSpacing w:w="15" w:type="dxa"/>
+        <w:tblBorders>
+          <w:top w:val="single" w:sz="4" w:space="0" w:color="auto"/>
+          <w:left w:val="single" w:sz="4" w:space="0" w:color="auto"/>
+          <w:bottom w:val="single" w:sz="4" w:space="0" w:color="auto"/>
+          <w:right w:val="single" w:sz="4" w:space="0" w:color="auto"/>
+          <w:insideH w:val="single" w:sz="4" w:space="0" w:color="auto"/>
+          <w:insideV w:val="single" w:sz="4" w:space="0" w:color="auto"/>
+        </w:tblBorders>
         <w:tblLayout w:type="fixed"/>
         <w:tblCellMar>
           <w:top w:w="43" w:type="dxa"/>
@@ -8239,6 +8334,14 @@
       <w:tblPr>
         <w:tblW w:w="13050" w:type="dxa"/>
         <w:tblCellSpacing w:w="15" w:type="dxa"/>
+        <w:tblBorders>
+          <w:top w:val="single" w:sz="4" w:space="0" w:color="auto"/>
+          <w:left w:val="single" w:sz="4" w:space="0" w:color="auto"/>
+          <w:bottom w:val="single" w:sz="4" w:space="0" w:color="auto"/>
+          <w:right w:val="single" w:sz="4" w:space="0" w:color="auto"/>
+          <w:insideH w:val="single" w:sz="4" w:space="0" w:color="auto"/>
+          <w:insideV w:val="single" w:sz="4" w:space="0" w:color="auto"/>
+        </w:tblBorders>
         <w:tblLayout w:type="fixed"/>
         <w:tblCellMar>
           <w:top w:w="43" w:type="dxa"/>
@@ -8495,7 +8598,6 @@
           <w:sz w:val="26"/>
           <w:szCs w:val="26"/>
         </w:rPr>
-        <w:lastRenderedPageBreak/>
         <w:t>Phoenix Headquarters End Devices</w:t>
       </w:r>
     </w:p>
@@ -8504,6 +8606,14 @@
         <w:tblW w:w="14400" w:type="dxa"/>
         <w:tblCellSpacing w:w="15" w:type="dxa"/>
         <w:tblInd w:w="-630" w:type="dxa"/>
+        <w:tblBorders>
+          <w:top w:val="single" w:sz="4" w:space="0" w:color="auto"/>
+          <w:left w:val="single" w:sz="4" w:space="0" w:color="auto"/>
+          <w:bottom w:val="single" w:sz="4" w:space="0" w:color="auto"/>
+          <w:right w:val="single" w:sz="4" w:space="0" w:color="auto"/>
+          <w:insideH w:val="single" w:sz="4" w:space="0" w:color="auto"/>
+          <w:insideV w:val="single" w:sz="4" w:space="0" w:color="auto"/>
+        </w:tblBorders>
         <w:tblLayout w:type="fixed"/>
         <w:tblCellMar>
           <w:top w:w="43" w:type="dxa"/>
@@ -9292,7 +9402,6 @@
         <w:spacing w:before="100" w:beforeAutospacing="1" w:after="100" w:afterAutospacing="1"/>
       </w:pPr>
       <w:r>
-        <w:lastRenderedPageBreak/>
         <w:t xml:space="preserve">Additional subnets reserved for future growth at these locations should remain documented in the addressing plan but </w:t>
       </w:r>
       <w:r>
@@ -9335,21 +9444,6 @@
       <w:r>
         <w:t xml:space="preserve"> A subnet appearing in the Enterprise IP Addressing Plan does not authorize its implementation. Configure only the networks and interfaces specifically required by the applicable ECR.</w:t>
       </w:r>
-    </w:p>
-    <w:p>
-      <w:pPr>
-        <w:pStyle w:val="Heading4"/>
-      </w:pPr>
-    </w:p>
-    <w:p>
-      <w:pPr>
-        <w:pStyle w:val="Heading4"/>
-      </w:pPr>
-    </w:p>
-    <w:p>
-      <w:pPr>
-        <w:pStyle w:val="Heading4"/>
-      </w:pPr>
     </w:p>
     <w:p>
       <w:pPr>
@@ -9381,6 +9475,14 @@
       <w:tblPr>
         <w:tblW w:w="0" w:type="auto"/>
         <w:tblCellSpacing w:w="15" w:type="dxa"/>
+        <w:tblBorders>
+          <w:top w:val="single" w:sz="4" w:space="0" w:color="auto"/>
+          <w:left w:val="single" w:sz="4" w:space="0" w:color="auto"/>
+          <w:bottom w:val="single" w:sz="4" w:space="0" w:color="auto"/>
+          <w:right w:val="single" w:sz="4" w:space="0" w:color="auto"/>
+          <w:insideH w:val="single" w:sz="4" w:space="0" w:color="auto"/>
+          <w:insideV w:val="single" w:sz="4" w:space="0" w:color="auto"/>
+        </w:tblBorders>
         <w:tblLayout w:type="fixed"/>
         <w:tblCellMar>
           <w:top w:w="43" w:type="dxa"/>
@@ -9813,7 +9915,6 @@
           <w:sz w:val="27"/>
           <w:szCs w:val="27"/>
         </w:rPr>
-        <w:lastRenderedPageBreak/>
         <w:t>TUC-R2 – Future Interface IP Addressing</w:t>
       </w:r>
     </w:p>
@@ -9852,6 +9953,14 @@
       <w:tblPr>
         <w:tblW w:w="0" w:type="auto"/>
         <w:tblCellSpacing w:w="15" w:type="dxa"/>
+        <w:tblBorders>
+          <w:top w:val="single" w:sz="4" w:space="0" w:color="auto"/>
+          <w:left w:val="single" w:sz="4" w:space="0" w:color="auto"/>
+          <w:bottom w:val="single" w:sz="4" w:space="0" w:color="auto"/>
+          <w:right w:val="single" w:sz="4" w:space="0" w:color="auto"/>
+          <w:insideH w:val="single" w:sz="4" w:space="0" w:color="auto"/>
+          <w:insideV w:val="single" w:sz="4" w:space="0" w:color="auto"/>
+        </w:tblBorders>
         <w:tblLayout w:type="fixed"/>
         <w:tblCellMar>
           <w:top w:w="43" w:type="dxa"/>
@@ -10347,6 +10456,14 @@
       <w:tblPr>
         <w:tblW w:w="0" w:type="auto"/>
         <w:tblCellSpacing w:w="15" w:type="dxa"/>
+        <w:tblBorders>
+          <w:top w:val="single" w:sz="4" w:space="0" w:color="auto"/>
+          <w:left w:val="single" w:sz="4" w:space="0" w:color="auto"/>
+          <w:bottom w:val="single" w:sz="4" w:space="0" w:color="auto"/>
+          <w:right w:val="single" w:sz="4" w:space="0" w:color="auto"/>
+          <w:insideH w:val="single" w:sz="4" w:space="0" w:color="auto"/>
+          <w:insideV w:val="single" w:sz="4" w:space="0" w:color="auto"/>
+        </w:tblBorders>
         <w:tblLayout w:type="fixed"/>
         <w:tblCellMar>
           <w:top w:w="43" w:type="dxa"/>
@@ -10611,6 +10728,14 @@
         <w:tblW w:w="14400" w:type="dxa"/>
         <w:tblCellSpacing w:w="15" w:type="dxa"/>
         <w:tblInd w:w="-630" w:type="dxa"/>
+        <w:tblBorders>
+          <w:top w:val="single" w:sz="4" w:space="0" w:color="auto"/>
+          <w:left w:val="single" w:sz="4" w:space="0" w:color="auto"/>
+          <w:bottom w:val="single" w:sz="4" w:space="0" w:color="auto"/>
+          <w:right w:val="single" w:sz="4" w:space="0" w:color="auto"/>
+          <w:insideH w:val="single" w:sz="4" w:space="0" w:color="auto"/>
+          <w:insideV w:val="single" w:sz="4" w:space="0" w:color="auto"/>
+        </w:tblBorders>
         <w:tblLayout w:type="fixed"/>
         <w:tblCellMar>
           <w:top w:w="43" w:type="dxa"/>
@@ -10660,7 +10785,6 @@
                 <w:sz w:val="28"/>
                 <w:szCs w:val="28"/>
               </w:rPr>
-              <w:lastRenderedPageBreak/>
               <w:t>Department</w:t>
             </w:r>
           </w:p>
@@ -11051,6 +11175,14 @@
       <w:tblPr>
         <w:tblW w:w="0" w:type="auto"/>
         <w:tblCellSpacing w:w="15" w:type="dxa"/>
+        <w:tblBorders>
+          <w:top w:val="single" w:sz="4" w:space="0" w:color="auto"/>
+          <w:left w:val="single" w:sz="4" w:space="0" w:color="auto"/>
+          <w:bottom w:val="single" w:sz="4" w:space="0" w:color="auto"/>
+          <w:right w:val="single" w:sz="4" w:space="0" w:color="auto"/>
+          <w:insideH w:val="single" w:sz="4" w:space="0" w:color="auto"/>
+          <w:insideV w:val="single" w:sz="4" w:space="0" w:color="auto"/>
+        </w:tblBorders>
         <w:tblLayout w:type="fixed"/>
         <w:tblCellMar>
           <w:top w:w="43" w:type="dxa"/>
@@ -11487,6 +11619,14 @@
       <w:tblPr>
         <w:tblW w:w="0" w:type="auto"/>
         <w:tblCellSpacing w:w="15" w:type="dxa"/>
+        <w:tblBorders>
+          <w:top w:val="single" w:sz="4" w:space="0" w:color="auto"/>
+          <w:left w:val="single" w:sz="4" w:space="0" w:color="auto"/>
+          <w:bottom w:val="single" w:sz="4" w:space="0" w:color="auto"/>
+          <w:right w:val="single" w:sz="4" w:space="0" w:color="auto"/>
+          <w:insideH w:val="single" w:sz="4" w:space="0" w:color="auto"/>
+          <w:insideV w:val="single" w:sz="4" w:space="0" w:color="auto"/>
+        </w:tblBorders>
         <w:tblLayout w:type="fixed"/>
         <w:tblCellMar>
           <w:top w:w="43" w:type="dxa"/>
@@ -11743,7 +11883,6 @@
           <w:sz w:val="26"/>
           <w:szCs w:val="26"/>
         </w:rPr>
-        <w:lastRenderedPageBreak/>
         <w:t>Flagstaff End Devices</w:t>
       </w:r>
     </w:p>
@@ -11752,6 +11891,14 @@
         <w:tblW w:w="14400" w:type="dxa"/>
         <w:tblCellSpacing w:w="15" w:type="dxa"/>
         <w:tblInd w:w="-630" w:type="dxa"/>
+        <w:tblBorders>
+          <w:top w:val="single" w:sz="4" w:space="0" w:color="auto"/>
+          <w:left w:val="single" w:sz="4" w:space="0" w:color="auto"/>
+          <w:bottom w:val="single" w:sz="4" w:space="0" w:color="auto"/>
+          <w:right w:val="single" w:sz="4" w:space="0" w:color="auto"/>
+          <w:insideH w:val="single" w:sz="4" w:space="0" w:color="auto"/>
+          <w:insideV w:val="single" w:sz="4" w:space="0" w:color="auto"/>
+        </w:tblBorders>
         <w:tblLayout w:type="fixed"/>
         <w:tblCellMar>
           <w:top w:w="43" w:type="dxa"/>
@@ -12303,7 +12450,6 @@
         <w:spacing w:before="100" w:beforeAutospacing="1" w:after="100" w:afterAutospacing="1"/>
       </w:pPr>
       <w:r>
-        <w:lastRenderedPageBreak/>
         <w:t xml:space="preserve">Record the assigned addressing for the end devices at </w:t>
       </w:r>
       <w:r>
@@ -12344,6 +12490,14 @@
       <w:tblPr>
         <w:tblW w:w="5000" w:type="pct"/>
         <w:tblCellSpacing w:w="15" w:type="dxa"/>
+        <w:tblBorders>
+          <w:top w:val="single" w:sz="4" w:space="0" w:color="auto"/>
+          <w:left w:val="single" w:sz="4" w:space="0" w:color="auto"/>
+          <w:bottom w:val="single" w:sz="4" w:space="0" w:color="auto"/>
+          <w:right w:val="single" w:sz="4" w:space="0" w:color="auto"/>
+          <w:insideH w:val="single" w:sz="4" w:space="0" w:color="auto"/>
+          <w:insideV w:val="single" w:sz="4" w:space="0" w:color="auto"/>
+        </w:tblBorders>
         <w:tblLayout w:type="fixed"/>
         <w:tblCellMar>
           <w:top w:w="43" w:type="dxa"/>
@@ -12357,10 +12511,10 @@
       </w:tblPr>
       <w:tblGrid>
         <w:gridCol w:w="1739"/>
-        <w:gridCol w:w="2171"/>
-        <w:gridCol w:w="2275"/>
-        <w:gridCol w:w="3414"/>
-        <w:gridCol w:w="3361"/>
+        <w:gridCol w:w="2169"/>
+        <w:gridCol w:w="2273"/>
+        <w:gridCol w:w="3411"/>
+        <w:gridCol w:w="3358"/>
       </w:tblGrid>
       <w:tr>
         <w:trPr>
@@ -12916,6 +13070,14 @@
       <w:tblPr>
         <w:tblW w:w="5000" w:type="pct"/>
         <w:tblCellSpacing w:w="15" w:type="dxa"/>
+        <w:tblBorders>
+          <w:top w:val="single" w:sz="4" w:space="0" w:color="auto"/>
+          <w:left w:val="single" w:sz="4" w:space="0" w:color="auto"/>
+          <w:bottom w:val="single" w:sz="4" w:space="0" w:color="auto"/>
+          <w:right w:val="single" w:sz="4" w:space="0" w:color="auto"/>
+          <w:insideH w:val="single" w:sz="4" w:space="0" w:color="auto"/>
+          <w:insideV w:val="single" w:sz="4" w:space="0" w:color="auto"/>
+        </w:tblBorders>
         <w:tblLayout w:type="fixed"/>
         <w:tblCellMar>
           <w:top w:w="43" w:type="dxa"/>
@@ -12929,10 +13091,10 @@
       </w:tblPr>
       <w:tblGrid>
         <w:gridCol w:w="1739"/>
-        <w:gridCol w:w="2171"/>
-        <w:gridCol w:w="2275"/>
-        <w:gridCol w:w="3414"/>
-        <w:gridCol w:w="3361"/>
+        <w:gridCol w:w="2169"/>
+        <w:gridCol w:w="2273"/>
+        <w:gridCol w:w="3411"/>
+        <w:gridCol w:w="3358"/>
       </w:tblGrid>
       <w:tr>
         <w:trPr>
@@ -13207,7 +13369,6 @@
               <w:jc w:val="center"/>
             </w:pPr>
             <w:r>
-              <w:lastRenderedPageBreak/>
               <w:t>PC-WH3</w:t>
             </w:r>
           </w:p>
@@ -13254,6 +13415,14 @@
       <w:tblPr>
         <w:tblW w:w="5000" w:type="pct"/>
         <w:tblCellSpacing w:w="15" w:type="dxa"/>
+        <w:tblBorders>
+          <w:top w:val="single" w:sz="4" w:space="0" w:color="auto"/>
+          <w:left w:val="single" w:sz="4" w:space="0" w:color="auto"/>
+          <w:bottom w:val="single" w:sz="4" w:space="0" w:color="auto"/>
+          <w:right w:val="single" w:sz="4" w:space="0" w:color="auto"/>
+          <w:insideH w:val="single" w:sz="4" w:space="0" w:color="auto"/>
+          <w:insideV w:val="single" w:sz="4" w:space="0" w:color="auto"/>
+        </w:tblBorders>
         <w:tblLayout w:type="fixed"/>
         <w:tblCellMar>
           <w:top w:w="43" w:type="dxa"/>
@@ -13267,10 +13436,10 @@
       </w:tblPr>
       <w:tblGrid>
         <w:gridCol w:w="1739"/>
-        <w:gridCol w:w="2171"/>
-        <w:gridCol w:w="2275"/>
-        <w:gridCol w:w="3414"/>
-        <w:gridCol w:w="3361"/>
+        <w:gridCol w:w="2169"/>
+        <w:gridCol w:w="2273"/>
+        <w:gridCol w:w="3411"/>
+        <w:gridCol w:w="3358"/>
       </w:tblGrid>
       <w:tr>
         <w:trPr>
@@ -13688,7 +13857,6 @@
         <w:pStyle w:val="Heading4"/>
       </w:pPr>
       <w:r>
-        <w:lastRenderedPageBreak/>
         <w:t>Phoenix Headquarters – HSRPv2 Updated IPv4 Addressing</w:t>
       </w:r>
     </w:p>
@@ -13696,6 +13864,14 @@
       <w:tblPr>
         <w:tblW w:w="5000" w:type="pct"/>
         <w:tblCellSpacing w:w="15" w:type="dxa"/>
+        <w:tblBorders>
+          <w:top w:val="single" w:sz="4" w:space="0" w:color="auto"/>
+          <w:left w:val="single" w:sz="4" w:space="0" w:color="auto"/>
+          <w:bottom w:val="single" w:sz="4" w:space="0" w:color="auto"/>
+          <w:right w:val="single" w:sz="4" w:space="0" w:color="auto"/>
+          <w:insideH w:val="single" w:sz="4" w:space="0" w:color="auto"/>
+          <w:insideV w:val="single" w:sz="4" w:space="0" w:color="auto"/>
+        </w:tblBorders>
         <w:tblLayout w:type="fixed"/>
         <w:tblCellMar>
           <w:top w:w="43" w:type="dxa"/>
@@ -13708,11 +13884,11 @@
         <w:tblDescription w:val="Students use the table to complete the Enterprise Interface Addressing Plan for IPv4 and IPv6, including the interface or device name, purpose, IPv4 address and prefix, IPv4 default gateway, IPv6 address and prefix, and IPv6 default gateway. &#10;"/>
       </w:tblPr>
       <w:tblGrid>
-        <w:gridCol w:w="1350"/>
-        <w:gridCol w:w="2902"/>
-        <w:gridCol w:w="2903"/>
-        <w:gridCol w:w="2902"/>
-        <w:gridCol w:w="2903"/>
+        <w:gridCol w:w="1348"/>
+        <w:gridCol w:w="2900"/>
+        <w:gridCol w:w="2901"/>
+        <w:gridCol w:w="2900"/>
+        <w:gridCol w:w="2901"/>
       </w:tblGrid>
       <w:tr>
         <w:trPr>
@@ -14291,6 +14467,14 @@
       <w:tblPr>
         <w:tblW w:w="5000" w:type="pct"/>
         <w:tblCellSpacing w:w="15" w:type="dxa"/>
+        <w:tblBorders>
+          <w:top w:val="single" w:sz="4" w:space="0" w:color="auto"/>
+          <w:left w:val="single" w:sz="4" w:space="0" w:color="auto"/>
+          <w:bottom w:val="single" w:sz="4" w:space="0" w:color="auto"/>
+          <w:right w:val="single" w:sz="4" w:space="0" w:color="auto"/>
+          <w:insideH w:val="single" w:sz="4" w:space="0" w:color="auto"/>
+          <w:insideV w:val="single" w:sz="4" w:space="0" w:color="auto"/>
+        </w:tblBorders>
         <w:tblLayout w:type="fixed"/>
         <w:tblCellMar>
           <w:top w:w="43" w:type="dxa"/>
@@ -14303,11 +14487,11 @@
         <w:tblDescription w:val="Students use the table to complete the Enterprise Interface Addressing Plan for IPv4 and IPv6, including the interface or device name, purpose, IPv4 address and prefix, IPv4 default gateway, IPv6 address and prefix, and IPv6 default gateway. &#10;"/>
       </w:tblPr>
       <w:tblGrid>
-        <w:gridCol w:w="1350"/>
-        <w:gridCol w:w="2902"/>
-        <w:gridCol w:w="2903"/>
-        <w:gridCol w:w="4095"/>
-        <w:gridCol w:w="1710"/>
+        <w:gridCol w:w="1348"/>
+        <w:gridCol w:w="2900"/>
+        <w:gridCol w:w="2901"/>
+        <w:gridCol w:w="4092"/>
+        <w:gridCol w:w="1709"/>
       </w:tblGrid>
       <w:tr>
         <w:trPr>
@@ -14338,7 +14522,6 @@
                 <w:sz w:val="28"/>
                 <w:szCs w:val="28"/>
               </w:rPr>
-              <w:lastRenderedPageBreak/>
               <w:t>Interface</w:t>
             </w:r>
           </w:p>
@@ -15000,6 +15183,14 @@
       <w:tblPr>
         <w:tblW w:w="5000" w:type="pct"/>
         <w:tblCellSpacing w:w="15" w:type="dxa"/>
+        <w:tblBorders>
+          <w:top w:val="single" w:sz="4" w:space="0" w:color="auto"/>
+          <w:left w:val="single" w:sz="4" w:space="0" w:color="auto"/>
+          <w:bottom w:val="single" w:sz="4" w:space="0" w:color="auto"/>
+          <w:right w:val="single" w:sz="4" w:space="0" w:color="auto"/>
+          <w:insideH w:val="single" w:sz="4" w:space="0" w:color="auto"/>
+          <w:insideV w:val="single" w:sz="4" w:space="0" w:color="auto"/>
+        </w:tblBorders>
         <w:tblLayout w:type="fixed"/>
         <w:tblCellMar>
           <w:top w:w="43" w:type="dxa"/>
@@ -15012,10 +15203,10 @@
         <w:tblDescription w:val="Students use the table to complete the Enterprise Interface Addressing Plan for IPv4 and IPv6, including the interface or device name, purpose, IPv4 address and prefix, IPv4 default gateway, IPv6 address and prefix, and IPv6 default gateway. &#10;"/>
       </w:tblPr>
       <w:tblGrid>
-        <w:gridCol w:w="2354"/>
-        <w:gridCol w:w="2949"/>
-        <w:gridCol w:w="5767"/>
-        <w:gridCol w:w="1890"/>
+        <w:gridCol w:w="2352"/>
+        <w:gridCol w:w="2947"/>
+        <w:gridCol w:w="5762"/>
+        <w:gridCol w:w="1889"/>
       </w:tblGrid>
       <w:tr>
         <w:trPr>
@@ -15045,7 +15236,6 @@
                 <w:sz w:val="28"/>
                 <w:szCs w:val="28"/>
               </w:rPr>
-              <w:lastRenderedPageBreak/>
               <w:t>Device</w:t>
             </w:r>
           </w:p>
@@ -15544,6 +15734,14 @@
       <w:tblPr>
         <w:tblW w:w="0" w:type="auto"/>
         <w:tblCellSpacing w:w="15" w:type="dxa"/>
+        <w:tblBorders>
+          <w:top w:val="single" w:sz="4" w:space="0" w:color="auto"/>
+          <w:left w:val="single" w:sz="4" w:space="0" w:color="auto"/>
+          <w:bottom w:val="single" w:sz="4" w:space="0" w:color="auto"/>
+          <w:right w:val="single" w:sz="4" w:space="0" w:color="auto"/>
+          <w:insideH w:val="single" w:sz="4" w:space="0" w:color="auto"/>
+          <w:insideV w:val="single" w:sz="4" w:space="0" w:color="auto"/>
+        </w:tblBorders>
         <w:tblLayout w:type="fixed"/>
         <w:tblCellMar>
           <w:top w:w="43" w:type="dxa"/>

</xml_diff>

<commit_message>
Uploaded corrected Enteprise IP Addressing Plan
</commit_message>
<xml_diff>
--- a/downloads/SOE - Enterprise_IP_Address_Plan.docx
+++ b/downloads/SOE - Enterprise_IP_Address_Plan.docx
@@ -861,6 +861,14 @@
       <w:tblPr>
         <w:tblW w:w="5000" w:type="pct"/>
         <w:tblCellSpacing w:w="15" w:type="dxa"/>
+        <w:tblBorders>
+          <w:top w:val="single" w:sz="4" w:space="0" w:color="auto"/>
+          <w:left w:val="single" w:sz="4" w:space="0" w:color="auto"/>
+          <w:bottom w:val="single" w:sz="4" w:space="0" w:color="auto"/>
+          <w:right w:val="single" w:sz="4" w:space="0" w:color="auto"/>
+          <w:insideH w:val="single" w:sz="4" w:space="0" w:color="auto"/>
+          <w:insideV w:val="single" w:sz="4" w:space="0" w:color="auto"/>
+        </w:tblBorders>
         <w:tblCellMar>
           <w:top w:w="72" w:type="dxa"/>
           <w:left w:w="115" w:type="dxa"/>
@@ -872,9 +880,9 @@
         <w:tblDescription w:val="Table listing the network requirements for the Phoenix Headquarters location, including each department, associated VLAN ID, and required number of host addresses used to develop the enterprise IPv4 addressing plan."/>
       </w:tblPr>
       <w:tblGrid>
-        <w:gridCol w:w="5628"/>
-        <w:gridCol w:w="1977"/>
-        <w:gridCol w:w="1755"/>
+        <w:gridCol w:w="5592"/>
+        <w:gridCol w:w="1989"/>
+        <w:gridCol w:w="1769"/>
       </w:tblGrid>
       <w:tr>
         <w:trPr>

</xml_diff>